<commit_message>
feat: design & layout
</commit_message>
<xml_diff>
--- a/documentatie.docx
+++ b/documentatie.docx
@@ -467,17 +467,706 @@
     </w:p>
     <w:p>
       <w:pPr>
-        <w:shd w:fill="F5F5F5" w:val="clear"/>
-        <w:spacing w:after="160" w:before="80"/>
-        <w:ind w:left="360"/>
-      </w:pPr>
-      <w:r>
-        <w:rPr>
-          <w:i/>
-          <w:iCs/>
-          <w:color w:val="888888"/>
-        </w:rPr>
-        <w:t xml:space="preserve">→ plak hier de volledige inhoud van je CLAUDE.md</w:t>
+        <w:shd w:fill="F0F0F0" w:val="clear"/>
+        <w:spacing w:after="0"/>
+        <w:ind w:left="360"/>
+      </w:pPr>
+      <w:r>
+        <w:rPr>
+          <w:rFonts w:ascii="Courier New" w:cs="Courier New" w:eastAsia="Courier New" w:hAnsi="Courier New"/>
+          <w:color w:val="333333"/>
+          <w:sz w:val="20"/>
+          <w:szCs w:val="20"/>
+        </w:rPr>
+        <w:t xml:space="preserve"># CLAUDE.md</w:t>
+      </w:r>
+    </w:p>
+    <w:p>
+      <w:pPr>
+        <w:shd w:fill="F0F0F0" w:val="clear"/>
+        <w:spacing w:after="0"/>
+        <w:ind w:left="360"/>
+      </w:pPr>
+      <w:r>
+        <w:rPr>
+          <w:rFonts w:ascii="Courier New" w:cs="Courier New" w:eastAsia="Courier New" w:hAnsi="Courier New"/>
+          <w:color w:val="333333"/>
+          <w:sz w:val="20"/>
+          <w:szCs w:val="20"/>
+        </w:rPr>
+        <w:t xml:space="preserve"/>
+      </w:r>
+    </w:p>
+    <w:p>
+      <w:pPr>
+        <w:shd w:fill="F0F0F0" w:val="clear"/>
+        <w:spacing w:after="0"/>
+        <w:ind w:left="360"/>
+      </w:pPr>
+      <w:r>
+        <w:rPr>
+          <w:rFonts w:ascii="Courier New" w:cs="Courier New" w:eastAsia="Courier New" w:hAnsi="Courier New"/>
+          <w:color w:val="333333"/>
+          <w:sz w:val="20"/>
+          <w:szCs w:val="20"/>
+        </w:rPr>
+        <w:t xml:space="preserve">This file gives Claude Code the context it needs when working in this repository.</w:t>
+      </w:r>
+    </w:p>
+    <w:p>
+      <w:pPr>
+        <w:shd w:fill="F0F0F0" w:val="clear"/>
+        <w:spacing w:after="0"/>
+        <w:ind w:left="360"/>
+      </w:pPr>
+      <w:r>
+        <w:rPr>
+          <w:rFonts w:ascii="Courier New" w:cs="Courier New" w:eastAsia="Courier New" w:hAnsi="Courier New"/>
+          <w:color w:val="333333"/>
+          <w:sz w:val="20"/>
+          <w:szCs w:val="20"/>
+        </w:rPr>
+        <w:t xml:space="preserve"/>
+      </w:r>
+    </w:p>
+    <w:p>
+      <w:pPr>
+        <w:shd w:fill="F0F0F0" w:val="clear"/>
+        <w:spacing w:after="0"/>
+        <w:ind w:left="360"/>
+      </w:pPr>
+      <w:r>
+        <w:rPr>
+          <w:rFonts w:ascii="Courier New" w:cs="Courier New" w:eastAsia="Courier New" w:hAnsi="Courier New"/>
+          <w:color w:val="333333"/>
+          <w:sz w:val="20"/>
+          <w:szCs w:val="20"/>
+        </w:rPr>
+        <w:t xml:space="preserve">## Project info</w:t>
+      </w:r>
+    </w:p>
+    <w:p>
+      <w:pPr>
+        <w:shd w:fill="F0F0F0" w:val="clear"/>
+        <w:spacing w:after="0"/>
+        <w:ind w:left="360"/>
+      </w:pPr>
+      <w:r>
+        <w:rPr>
+          <w:rFonts w:ascii="Courier New" w:cs="Courier New" w:eastAsia="Courier New" w:hAnsi="Courier New"/>
+          <w:color w:val="333333"/>
+          <w:sz w:val="20"/>
+          <w:szCs w:val="20"/>
+        </w:rPr>
+        <w:t xml:space="preserve">- Course: Dynamic Web Development (DWD)</w:t>
+      </w:r>
+    </w:p>
+    <w:p>
+      <w:pPr>
+        <w:shd w:fill="F0F0F0" w:val="clear"/>
+        <w:spacing w:after="0"/>
+        <w:ind w:left="360"/>
+      </w:pPr>
+      <w:r>
+        <w:rPr>
+          <w:rFonts w:ascii="Courier New" w:cs="Courier New" w:eastAsia="Courier New" w:hAnsi="Courier New"/>
+          <w:color w:val="333333"/>
+          <w:sz w:val="20"/>
+          <w:szCs w:val="20"/>
+        </w:rPr>
+        <w:t xml:space="preserve">- School: Odisee (Belgium)</w:t>
+      </w:r>
+    </w:p>
+    <w:p>
+      <w:pPr>
+        <w:shd w:fill="F0F0F0" w:val="clear"/>
+        <w:spacing w:after="0"/>
+        <w:ind w:left="360"/>
+      </w:pPr>
+      <w:r>
+        <w:rPr>
+          <w:rFonts w:ascii="Courier New" w:cs="Courier New" w:eastAsia="Courier New" w:hAnsi="Courier New"/>
+          <w:color w:val="333333"/>
+          <w:sz w:val="20"/>
+          <w:szCs w:val="20"/>
+        </w:rPr>
+        <w:t xml:space="preserve">- Programme: Applied Informatics, 1st year</w:t>
+      </w:r>
+    </w:p>
+    <w:p>
+      <w:pPr>
+        <w:shd w:fill="F0F0F0" w:val="clear"/>
+        <w:spacing w:after="0"/>
+        <w:ind w:left="360"/>
+      </w:pPr>
+      <w:r>
+        <w:rPr>
+          <w:rFonts w:ascii="Courier New" w:cs="Courier New" w:eastAsia="Courier New" w:hAnsi="Courier New"/>
+          <w:color w:val="333333"/>
+          <w:sz w:val="20"/>
+          <w:szCs w:val="20"/>
+        </w:rPr>
+        <w:t xml:space="preserve">- Project: Soundboard web app</w:t>
+      </w:r>
+    </w:p>
+    <w:p>
+      <w:pPr>
+        <w:shd w:fill="F0F0F0" w:val="clear"/>
+        <w:spacing w:after="0"/>
+        <w:ind w:left="360"/>
+      </w:pPr>
+      <w:r>
+        <w:rPr>
+          <w:rFonts w:ascii="Courier New" w:cs="Courier New" w:eastAsia="Courier New" w:hAnsi="Courier New"/>
+          <w:color w:val="333333"/>
+          <w:sz w:val="20"/>
+          <w:szCs w:val="20"/>
+        </w:rPr>
+        <w:t xml:space="preserve">- Description: A soundboard that lets users search for sound effects through the Freesound.org API,</w:t>
+      </w:r>
+    </w:p>
+    <w:p>
+      <w:pPr>
+        <w:shd w:fill="F0F0F0" w:val="clear"/>
+        <w:spacing w:after="0"/>
+        <w:ind w:left="360"/>
+      </w:pPr>
+      <w:r>
+        <w:rPr>
+          <w:rFonts w:ascii="Courier New" w:cs="Courier New" w:eastAsia="Courier New" w:hAnsi="Courier New"/>
+          <w:color w:val="333333"/>
+          <w:sz w:val="20"/>
+          <w:szCs w:val="20"/>
+        </w:rPr>
+        <w:t xml:space="preserve">  preview and play them, and save favourites to a personal dashboard.</w:t>
+      </w:r>
+    </w:p>
+    <w:p>
+      <w:pPr>
+        <w:shd w:fill="F0F0F0" w:val="clear"/>
+        <w:spacing w:after="0"/>
+        <w:ind w:left="360"/>
+      </w:pPr>
+      <w:r>
+        <w:rPr>
+          <w:rFonts w:ascii="Courier New" w:cs="Courier New" w:eastAsia="Courier New" w:hAnsi="Courier New"/>
+          <w:color w:val="333333"/>
+          <w:sz w:val="20"/>
+          <w:szCs w:val="20"/>
+        </w:rPr>
+        <w:t xml:space="preserve">  Favourites must persist across page reloads using localStorage.</w:t>
+      </w:r>
+    </w:p>
+    <w:p>
+      <w:pPr>
+        <w:shd w:fill="F0F0F0" w:val="clear"/>
+        <w:spacing w:after="0"/>
+        <w:ind w:left="360"/>
+      </w:pPr>
+      <w:r>
+        <w:rPr>
+          <w:rFonts w:ascii="Courier New" w:cs="Courier New" w:eastAsia="Courier New" w:hAnsi="Courier New"/>
+          <w:color w:val="333333"/>
+          <w:sz w:val="20"/>
+          <w:szCs w:val="20"/>
+        </w:rPr>
+        <w:t xml:space="preserve"/>
+      </w:r>
+    </w:p>
+    <w:p>
+      <w:pPr>
+        <w:shd w:fill="F0F0F0" w:val="clear"/>
+        <w:spacing w:after="0"/>
+        <w:ind w:left="360"/>
+      </w:pPr>
+      <w:r>
+        <w:rPr>
+          <w:rFonts w:ascii="Courier New" w:cs="Courier New" w:eastAsia="Courier New" w:hAnsi="Courier New"/>
+          <w:color w:val="333333"/>
+          <w:sz w:val="20"/>
+          <w:szCs w:val="20"/>
+        </w:rPr>
+        <w:t xml:space="preserve">## Tech stack</w:t>
+      </w:r>
+    </w:p>
+    <w:p>
+      <w:pPr>
+        <w:shd w:fill="F0F0F0" w:val="clear"/>
+        <w:spacing w:after="0"/>
+        <w:ind w:left="360"/>
+      </w:pPr>
+      <w:r>
+        <w:rPr>
+          <w:rFonts w:ascii="Courier New" w:cs="Courier New" w:eastAsia="Courier New" w:hAnsi="Courier New"/>
+          <w:color w:val="333333"/>
+          <w:sz w:val="20"/>
+          <w:szCs w:val="20"/>
+        </w:rPr>
+        <w:t xml:space="preserve">- HTML5 / CSS3 / Vanilla JavaScript (ES modules, async/await)</w:t>
+      </w:r>
+    </w:p>
+    <w:p>
+      <w:pPr>
+        <w:shd w:fill="F0F0F0" w:val="clear"/>
+        <w:spacing w:after="0"/>
+        <w:ind w:left="360"/>
+      </w:pPr>
+      <w:r>
+        <w:rPr>
+          <w:rFonts w:ascii="Courier New" w:cs="Courier New" w:eastAsia="Courier New" w:hAnsi="Courier New"/>
+          <w:color w:val="333333"/>
+          <w:sz w:val="20"/>
+          <w:szCs w:val="20"/>
+        </w:rPr>
+        <w:t xml:space="preserve">- Biome for linting and formatting</w:t>
+      </w:r>
+    </w:p>
+    <w:p>
+      <w:pPr>
+        <w:shd w:fill="F0F0F0" w:val="clear"/>
+        <w:spacing w:after="0"/>
+        <w:ind w:left="360"/>
+      </w:pPr>
+      <w:r>
+        <w:rPr>
+          <w:rFonts w:ascii="Courier New" w:cs="Courier New" w:eastAsia="Courier New" w:hAnsi="Courier New"/>
+          <w:color w:val="333333"/>
+          <w:sz w:val="20"/>
+          <w:szCs w:val="20"/>
+        </w:rPr>
+        <w:t xml:space="preserve">- External API: Freesound.org</w:t>
+      </w:r>
+    </w:p>
+    <w:p>
+      <w:pPr>
+        <w:shd w:fill="F0F0F0" w:val="clear"/>
+        <w:spacing w:after="0"/>
+        <w:ind w:left="360"/>
+      </w:pPr>
+      <w:r>
+        <w:rPr>
+          <w:rFonts w:ascii="Courier New" w:cs="Courier New" w:eastAsia="Courier New" w:hAnsi="Courier New"/>
+          <w:color w:val="333333"/>
+          <w:sz w:val="20"/>
+          <w:szCs w:val="20"/>
+        </w:rPr>
+        <w:t xml:space="preserve"/>
+      </w:r>
+    </w:p>
+    <w:p>
+      <w:pPr>
+        <w:shd w:fill="F0F0F0" w:val="clear"/>
+        <w:spacing w:after="0"/>
+        <w:ind w:left="360"/>
+      </w:pPr>
+      <w:r>
+        <w:rPr>
+          <w:rFonts w:ascii="Courier New" w:cs="Courier New" w:eastAsia="Courier New" w:hAnsi="Courier New"/>
+          <w:color w:val="333333"/>
+          <w:sz w:val="20"/>
+          <w:szCs w:val="20"/>
+        </w:rPr>
+        <w:t xml:space="preserve">## Project structure</w:t>
+      </w:r>
+    </w:p>
+    <w:p>
+      <w:pPr>
+        <w:shd w:fill="F0F0F0" w:val="clear"/>
+        <w:spacing w:after="0"/>
+        <w:ind w:left="360"/>
+      </w:pPr>
+      <w:r>
+        <w:rPr>
+          <w:rFonts w:ascii="Courier New" w:cs="Courier New" w:eastAsia="Courier New" w:hAnsi="Courier New"/>
+          <w:color w:val="333333"/>
+          <w:sz w:val="20"/>
+          <w:szCs w:val="20"/>
+        </w:rPr>
+        <w:t xml:space="preserve">  ├── index.html    ├── index.css    ├── index.js</w:t>
+      </w:r>
+    </w:p>
+    <w:p>
+      <w:pPr>
+        <w:shd w:fill="F0F0F0" w:val="clear"/>
+        <w:spacing w:after="0"/>
+        <w:ind w:left="360"/>
+      </w:pPr>
+      <w:r>
+        <w:rPr>
+          <w:rFonts w:ascii="Courier New" w:cs="Courier New" w:eastAsia="Courier New" w:hAnsi="Courier New"/>
+          <w:color w:val="333333"/>
+          <w:sz w:val="20"/>
+          <w:szCs w:val="20"/>
+        </w:rPr>
+        <w:t xml:space="preserve">  ├── img/          ├── documentatie.docx    ├── biome.json</w:t>
+      </w:r>
+    </w:p>
+    <w:p>
+      <w:pPr>
+        <w:shd w:fill="F0F0F0" w:val="clear"/>
+        <w:spacing w:after="0"/>
+        <w:ind w:left="360"/>
+      </w:pPr>
+      <w:r>
+        <w:rPr>
+          <w:rFonts w:ascii="Courier New" w:cs="Courier New" w:eastAsia="Courier New" w:hAnsi="Courier New"/>
+          <w:color w:val="333333"/>
+          <w:sz w:val="20"/>
+          <w:szCs w:val="20"/>
+        </w:rPr>
+        <w:t xml:space="preserve">  ├── package.json  └── CLAUDE.md</w:t>
+      </w:r>
+    </w:p>
+    <w:p>
+      <w:pPr>
+        <w:shd w:fill="F0F0F0" w:val="clear"/>
+        <w:spacing w:after="0"/>
+        <w:ind w:left="360"/>
+      </w:pPr>
+      <w:r>
+        <w:rPr>
+          <w:rFonts w:ascii="Courier New" w:cs="Courier New" w:eastAsia="Courier New" w:hAnsi="Courier New"/>
+          <w:color w:val="333333"/>
+          <w:sz w:val="20"/>
+          <w:szCs w:val="20"/>
+        </w:rPr>
+        <w:t xml:space="preserve"/>
+      </w:r>
+    </w:p>
+    <w:p>
+      <w:pPr>
+        <w:shd w:fill="F0F0F0" w:val="clear"/>
+        <w:spacing w:after="0"/>
+        <w:ind w:left="360"/>
+      </w:pPr>
+      <w:r>
+        <w:rPr>
+          <w:rFonts w:ascii="Courier New" w:cs="Courier New" w:eastAsia="Courier New" w:hAnsi="Courier New"/>
+          <w:color w:val="333333"/>
+          <w:sz w:val="20"/>
+          <w:szCs w:val="20"/>
+        </w:rPr>
+        <w:t xml:space="preserve">## Requirements</w:t>
+      </w:r>
+    </w:p>
+    <w:p>
+      <w:pPr>
+        <w:shd w:fill="F0F0F0" w:val="clear"/>
+        <w:spacing w:after="0"/>
+        <w:ind w:left="360"/>
+      </w:pPr>
+      <w:r>
+        <w:rPr>
+          <w:rFonts w:ascii="Courier New" w:cs="Courier New" w:eastAsia="Courier New" w:hAnsi="Courier New"/>
+          <w:color w:val="333333"/>
+          <w:sz w:val="20"/>
+          <w:szCs w:val="20"/>
+        </w:rPr>
+        <w:t xml:space="preserve">- Search sound effects via the Freesound.org API.</w:t>
+      </w:r>
+    </w:p>
+    <w:p>
+      <w:pPr>
+        <w:shd w:fill="F0F0F0" w:val="clear"/>
+        <w:spacing w:after="0"/>
+        <w:ind w:left="360"/>
+      </w:pPr>
+      <w:r>
+        <w:rPr>
+          <w:rFonts w:ascii="Courier New" w:cs="Courier New" w:eastAsia="Courier New" w:hAnsi="Courier New"/>
+          <w:color w:val="333333"/>
+          <w:sz w:val="20"/>
+          <w:szCs w:val="20"/>
+        </w:rPr>
+        <w:t xml:space="preserve">- Preview and play sounds in the browser.</w:t>
+      </w:r>
+    </w:p>
+    <w:p>
+      <w:pPr>
+        <w:shd w:fill="F0F0F0" w:val="clear"/>
+        <w:spacing w:after="0"/>
+        <w:ind w:left="360"/>
+      </w:pPr>
+      <w:r>
+        <w:rPr>
+          <w:rFonts w:ascii="Courier New" w:cs="Courier New" w:eastAsia="Courier New" w:hAnsi="Courier New"/>
+          <w:color w:val="333333"/>
+          <w:sz w:val="20"/>
+          <w:szCs w:val="20"/>
+        </w:rPr>
+        <w:t xml:space="preserve">- Save favourites to a personal dashboard.</w:t>
+      </w:r>
+    </w:p>
+    <w:p>
+      <w:pPr>
+        <w:shd w:fill="F0F0F0" w:val="clear"/>
+        <w:spacing w:after="0"/>
+        <w:ind w:left="360"/>
+      </w:pPr>
+      <w:r>
+        <w:rPr>
+          <w:rFonts w:ascii="Courier New" w:cs="Courier New" w:eastAsia="Courier New" w:hAnsi="Courier New"/>
+          <w:color w:val="333333"/>
+          <w:sz w:val="20"/>
+          <w:szCs w:val="20"/>
+        </w:rPr>
+        <w:t xml:space="preserve">- Persist the dashboard in localStorage.</w:t>
+      </w:r>
+    </w:p>
+    <w:p>
+      <w:pPr>
+        <w:shd w:fill="F0F0F0" w:val="clear"/>
+        <w:spacing w:after="0"/>
+        <w:ind w:left="360"/>
+      </w:pPr>
+      <w:r>
+        <w:rPr>
+          <w:rFonts w:ascii="Courier New" w:cs="Courier New" w:eastAsia="Courier New" w:hAnsi="Courier New"/>
+          <w:color w:val="333333"/>
+          <w:sz w:val="20"/>
+          <w:szCs w:val="20"/>
+        </w:rPr>
+        <w:t xml:space="preserve">- All API calls use fetch with async/await.</w:t>
+      </w:r>
+    </w:p>
+    <w:p>
+      <w:pPr>
+        <w:shd w:fill="F0F0F0" w:val="clear"/>
+        <w:spacing w:after="0"/>
+        <w:ind w:left="360"/>
+      </w:pPr>
+      <w:r>
+        <w:rPr>
+          <w:rFonts w:ascii="Courier New" w:cs="Courier New" w:eastAsia="Courier New" w:hAnsi="Courier New"/>
+          <w:color w:val="333333"/>
+          <w:sz w:val="20"/>
+          <w:szCs w:val="20"/>
+        </w:rPr>
+        <w:t xml:space="preserve">- Layout must be responsive.</w:t>
+      </w:r>
+    </w:p>
+    <w:p>
+      <w:pPr>
+        <w:shd w:fill="F0F0F0" w:val="clear"/>
+        <w:spacing w:after="0"/>
+        <w:ind w:left="360"/>
+      </w:pPr>
+      <w:r>
+        <w:rPr>
+          <w:rFonts w:ascii="Courier New" w:cs="Courier New" w:eastAsia="Courier New" w:hAnsi="Courier New"/>
+          <w:color w:val="333333"/>
+          <w:sz w:val="20"/>
+          <w:szCs w:val="20"/>
+        </w:rPr>
+        <w:t xml:space="preserve"/>
+      </w:r>
+    </w:p>
+    <w:p>
+      <w:pPr>
+        <w:shd w:fill="F0F0F0" w:val="clear"/>
+        <w:spacing w:after="0"/>
+        <w:ind w:left="360"/>
+      </w:pPr>
+      <w:r>
+        <w:rPr>
+          <w:rFonts w:ascii="Courier New" w:cs="Courier New" w:eastAsia="Courier New" w:hAnsi="Courier New"/>
+          <w:color w:val="333333"/>
+          <w:sz w:val="20"/>
+          <w:szCs w:val="20"/>
+        </w:rPr>
+        <w:t xml:space="preserve">## Rules</w:t>
+      </w:r>
+    </w:p>
+    <w:p>
+      <w:pPr>
+        <w:shd w:fill="F0F0F0" w:val="clear"/>
+        <w:spacing w:after="0"/>
+        <w:ind w:left="360"/>
+      </w:pPr>
+      <w:r>
+        <w:rPr>
+          <w:rFonts w:ascii="Courier New" w:cs="Courier New" w:eastAsia="Courier New" w:hAnsi="Courier New"/>
+          <w:color w:val="333333"/>
+          <w:sz w:val="20"/>
+          <w:szCs w:val="20"/>
+        </w:rPr>
+        <w:t xml:space="preserve">### Allowed</w:t>
+      </w:r>
+    </w:p>
+    <w:p>
+      <w:pPr>
+        <w:shd w:fill="F0F0F0" w:val="clear"/>
+        <w:spacing w:after="0"/>
+        <w:ind w:left="360"/>
+      </w:pPr>
+      <w:r>
+        <w:rPr>
+          <w:rFonts w:ascii="Courier New" w:cs="Courier New" w:eastAsia="Courier New" w:hAnsi="Courier New"/>
+          <w:color w:val="333333"/>
+          <w:sz w:val="20"/>
+          <w:szCs w:val="20"/>
+        </w:rPr>
+        <w:t xml:space="preserve">- Vanilla HTML, CSS, JavaScript only.</w:t>
+      </w:r>
+    </w:p>
+    <w:p>
+      <w:pPr>
+        <w:shd w:fill="F0F0F0" w:val="clear"/>
+        <w:spacing w:after="0"/>
+        <w:ind w:left="360"/>
+      </w:pPr>
+      <w:r>
+        <w:rPr>
+          <w:rFonts w:ascii="Courier New" w:cs="Courier New" w:eastAsia="Courier New" w:hAnsi="Courier New"/>
+          <w:color w:val="333333"/>
+          <w:sz w:val="20"/>
+          <w:szCs w:val="20"/>
+        </w:rPr>
+        <w:t xml:space="preserve">- Native browser APIs (fetch, localStorage, Audio, etc.).</w:t>
+      </w:r>
+    </w:p>
+    <w:p>
+      <w:pPr>
+        <w:shd w:fill="F0F0F0" w:val="clear"/>
+        <w:spacing w:after="0"/>
+        <w:ind w:left="360"/>
+      </w:pPr>
+      <w:r>
+        <w:rPr>
+          <w:rFonts w:ascii="Courier New" w:cs="Courier New" w:eastAsia="Courier New" w:hAnsi="Courier New"/>
+          <w:color w:val="333333"/>
+          <w:sz w:val="20"/>
+          <w:szCs w:val="20"/>
+        </w:rPr>
+        <w:t xml:space="preserve">- CSS custom properties, Flexbox, Grid.</w:t>
+      </w:r>
+    </w:p>
+    <w:p>
+      <w:pPr>
+        <w:shd w:fill="F0F0F0" w:val="clear"/>
+        <w:spacing w:after="0"/>
+        <w:ind w:left="360"/>
+      </w:pPr>
+      <w:r>
+        <w:rPr>
+          <w:rFonts w:ascii="Courier New" w:cs="Courier New" w:eastAsia="Courier New" w:hAnsi="Courier New"/>
+          <w:color w:val="333333"/>
+          <w:sz w:val="20"/>
+          <w:szCs w:val="20"/>
+        </w:rPr>
+        <w:t xml:space="preserve"/>
+      </w:r>
+    </w:p>
+    <w:p>
+      <w:pPr>
+        <w:shd w:fill="F0F0F0" w:val="clear"/>
+        <w:spacing w:after="0"/>
+        <w:ind w:left="360"/>
+      </w:pPr>
+      <w:r>
+        <w:rPr>
+          <w:rFonts w:ascii="Courier New" w:cs="Courier New" w:eastAsia="Courier New" w:hAnsi="Courier New"/>
+          <w:color w:val="333333"/>
+          <w:sz w:val="20"/>
+          <w:szCs w:val="20"/>
+        </w:rPr>
+        <w:t xml:space="preserve">### Not allowed</w:t>
+      </w:r>
+    </w:p>
+    <w:p>
+      <w:pPr>
+        <w:shd w:fill="F0F0F0" w:val="clear"/>
+        <w:spacing w:after="0"/>
+        <w:ind w:left="360"/>
+      </w:pPr>
+      <w:r>
+        <w:rPr>
+          <w:rFonts w:ascii="Courier New" w:cs="Courier New" w:eastAsia="Courier New" w:hAnsi="Courier New"/>
+          <w:color w:val="333333"/>
+          <w:sz w:val="20"/>
+          <w:szCs w:val="20"/>
+        </w:rPr>
+        <w:t xml:space="preserve">- No frameworks, no CSS frameworks, no JS libraries.</w:t>
+      </w:r>
+    </w:p>
+    <w:p>
+      <w:pPr>
+        <w:shd w:fill="F0F0F0" w:val="clear"/>
+        <w:spacing w:after="0"/>
+        <w:ind w:left="360"/>
+      </w:pPr>
+      <w:r>
+        <w:rPr>
+          <w:rFonts w:ascii="Courier New" w:cs="Courier New" w:eastAsia="Courier New" w:hAnsi="Courier New"/>
+          <w:color w:val="333333"/>
+          <w:sz w:val="20"/>
+          <w:szCs w:val="20"/>
+        </w:rPr>
+        <w:t xml:space="preserve">- No TypeScript. No inline scripts or styles.</w:t>
+      </w:r>
+    </w:p>
+    <w:p>
+      <w:pPr>
+        <w:shd w:fill="F0F0F0" w:val="clear"/>
+        <w:spacing w:after="0"/>
+        <w:ind w:left="360"/>
+      </w:pPr>
+      <w:r>
+        <w:rPr>
+          <w:rFonts w:ascii="Courier New" w:cs="Courier New" w:eastAsia="Courier New" w:hAnsi="Courier New"/>
+          <w:color w:val="333333"/>
+          <w:sz w:val="20"/>
+          <w:szCs w:val="20"/>
+        </w:rPr>
+        <w:t xml:space="preserve"/>
+      </w:r>
+    </w:p>
+    <w:p>
+      <w:pPr>
+        <w:shd w:fill="F0F0F0" w:val="clear"/>
+        <w:spacing w:after="0"/>
+        <w:ind w:left="360"/>
+      </w:pPr>
+      <w:r>
+        <w:rPr>
+          <w:rFonts w:ascii="Courier New" w:cs="Courier New" w:eastAsia="Courier New" w:hAnsi="Courier New"/>
+          <w:color w:val="333333"/>
+          <w:sz w:val="20"/>
+          <w:szCs w:val="20"/>
+        </w:rPr>
+        <w:t xml:space="preserve">### Conventions</w:t>
+      </w:r>
+    </w:p>
+    <w:p>
+      <w:pPr>
+        <w:shd w:fill="F0F0F0" w:val="clear"/>
+        <w:spacing w:after="0"/>
+        <w:ind w:left="360"/>
+      </w:pPr>
+      <w:r>
+        <w:rPr>
+          <w:rFonts w:ascii="Courier New" w:cs="Courier New" w:eastAsia="Courier New" w:hAnsi="Courier New"/>
+          <w:color w:val="333333"/>
+          <w:sz w:val="20"/>
+          <w:szCs w:val="20"/>
+        </w:rPr>
+        <w:t xml:space="preserve">- fetch with async/await only.</w:t>
+      </w:r>
+    </w:p>
+    <w:p>
+      <w:pPr>
+        <w:shd w:fill="F0F0F0" w:val="clear"/>
+        <w:spacing w:after="0"/>
+        <w:ind w:left="360"/>
+      </w:pPr>
+      <w:r>
+        <w:rPr>
+          <w:rFonts w:ascii="Courier New" w:cs="Courier New" w:eastAsia="Courier New" w:hAnsi="Courier New"/>
+          <w:color w:val="333333"/>
+          <w:sz w:val="20"/>
+          <w:szCs w:val="20"/>
+        </w:rPr>
+        <w:t xml:space="preserve">- Run npm run check before committing.</w:t>
       </w:r>
     </w:p>
     <w:p>
@@ -501,7 +1190,7 @@
         <w:spacing w:after="120"/>
       </w:pPr>
       <w:r>
-        <w:t xml:space="preserve">De initiële prompt is de eerste, uitgebreide prompt waarmee het project opgestart werd. Deze bevat context, doel en beperkingen.</w:t>
+        <w:t xml:space="preserve">De initiële prompt werd gebruikt om de projectstructuur op te zetten. Op dit punt werd nog geen applicatielogica geschreven — alleen de scaffold, Biome-configuratie en CLAUDE.md.</w:t>
       </w:r>
     </w:p>
     <w:p>
@@ -517,22 +1206,343 @@
         <w:pStyle w:val="Heading2"/>
       </w:pPr>
       <w:r>
-        <w:t xml:space="preserve">2.1 Context</w:t>
-      </w:r>
-    </w:p>
-    <w:p>
-      <w:pPr>
-        <w:shd w:fill="F5F5F5" w:val="clear"/>
-        <w:spacing w:after="160" w:before="80"/>
-        <w:ind w:left="360"/>
-      </w:pPr>
-      <w:r>
-        <w:rPr>
-          <w:i/>
-          <w:iCs/>
-          <w:color w:val="888888"/>
-        </w:rPr>
-        <w:t xml:space="preserve">→ beschrijf hier de context die je meegaf (opleiding, vak, geziene technieken...)</w:t>
+        <w:t xml:space="preserve">2.1 Volledige prompt</w:t>
+      </w:r>
+    </w:p>
+    <w:p>
+      <w:pPr>
+        <w:shd w:fill="F0F0F0" w:val="clear"/>
+        <w:spacing w:after="0"/>
+        <w:ind w:left="360"/>
+      </w:pPr>
+      <w:r>
+        <w:rPr>
+          <w:rFonts w:ascii="Courier New" w:cs="Courier New" w:eastAsia="Courier New" w:hAnsi="Courier New"/>
+          <w:color w:val="333333"/>
+          <w:sz w:val="20"/>
+          <w:szCs w:val="20"/>
+        </w:rPr>
+        <w:t xml:space="preserve">Create the following project structure for my soundboard app:</w:t>
+      </w:r>
+    </w:p>
+    <w:p>
+      <w:pPr>
+        <w:shd w:fill="F0F0F0" w:val="clear"/>
+        <w:spacing w:after="0"/>
+        <w:ind w:left="360"/>
+      </w:pPr>
+      <w:r>
+        <w:rPr>
+          <w:rFonts w:ascii="Courier New" w:cs="Courier New" w:eastAsia="Courier New" w:hAnsi="Courier New"/>
+          <w:color w:val="333333"/>
+          <w:sz w:val="20"/>
+          <w:szCs w:val="20"/>
+        </w:rPr>
+        <w:t xml:space="preserve">  - index.html — boilerplate only (doctype, head with linked CSS/JS, empty body)</w:t>
+      </w:r>
+    </w:p>
+    <w:p>
+      <w:pPr>
+        <w:shd w:fill="F0F0F0" w:val="clear"/>
+        <w:spacing w:after="0"/>
+        <w:ind w:left="360"/>
+      </w:pPr>
+      <w:r>
+        <w:rPr>
+          <w:rFonts w:ascii="Courier New" w:cs="Courier New" w:eastAsia="Courier New" w:hAnsi="Courier New"/>
+          <w:color w:val="333333"/>
+          <w:sz w:val="20"/>
+          <w:szCs w:val="20"/>
+        </w:rPr>
+        <w:t xml:space="preserve">  - index.css — empty file</w:t>
+      </w:r>
+    </w:p>
+    <w:p>
+      <w:pPr>
+        <w:shd w:fill="F0F0F0" w:val="clear"/>
+        <w:spacing w:after="0"/>
+        <w:ind w:left="360"/>
+      </w:pPr>
+      <w:r>
+        <w:rPr>
+          <w:rFonts w:ascii="Courier New" w:cs="Courier New" w:eastAsia="Courier New" w:hAnsi="Courier New"/>
+          <w:color w:val="333333"/>
+          <w:sz w:val="20"/>
+          <w:szCs w:val="20"/>
+        </w:rPr>
+        <w:t xml:space="preserve">  - index.js — empty file</w:t>
+      </w:r>
+    </w:p>
+    <w:p>
+      <w:pPr>
+        <w:shd w:fill="F0F0F0" w:val="clear"/>
+        <w:spacing w:after="0"/>
+        <w:ind w:left="360"/>
+      </w:pPr>
+      <w:r>
+        <w:rPr>
+          <w:rFonts w:ascii="Courier New" w:cs="Courier New" w:eastAsia="Courier New" w:hAnsi="Courier New"/>
+          <w:color w:val="333333"/>
+          <w:sz w:val="20"/>
+          <w:szCs w:val="20"/>
+        </w:rPr>
+        <w:t xml:space="preserve">  - img/ — empty folder (add a .gitkeep so it gets tracked)</w:t>
+      </w:r>
+    </w:p>
+    <w:p>
+      <w:pPr>
+        <w:shd w:fill="F0F0F0" w:val="clear"/>
+        <w:spacing w:after="0"/>
+        <w:ind w:left="360"/>
+      </w:pPr>
+      <w:r>
+        <w:rPr>
+          <w:rFonts w:ascii="Courier New" w:cs="Courier New" w:eastAsia="Courier New" w:hAnsi="Courier New"/>
+          <w:color w:val="333333"/>
+          <w:sz w:val="20"/>
+          <w:szCs w:val="20"/>
+        </w:rPr>
+        <w:t xml:space="preserve">  - documentatie.docx — empty Word document placeholder</w:t>
+      </w:r>
+    </w:p>
+    <w:p>
+      <w:pPr>
+        <w:shd w:fill="F0F0F0" w:val="clear"/>
+        <w:spacing w:after="0"/>
+        <w:ind w:left="360"/>
+      </w:pPr>
+      <w:r>
+        <w:rPr>
+          <w:rFonts w:ascii="Courier New" w:cs="Courier New" w:eastAsia="Courier New" w:hAnsi="Courier New"/>
+          <w:color w:val="333333"/>
+          <w:sz w:val="20"/>
+          <w:szCs w:val="20"/>
+        </w:rPr>
+        <w:t xml:space="preserve"/>
+      </w:r>
+    </w:p>
+    <w:p>
+      <w:pPr>
+        <w:shd w:fill="F0F0F0" w:val="clear"/>
+        <w:spacing w:after="0"/>
+        <w:ind w:left="360"/>
+      </w:pPr>
+      <w:r>
+        <w:rPr>
+          <w:rFonts w:ascii="Courier New" w:cs="Courier New" w:eastAsia="Courier New" w:hAnsi="Courier New"/>
+          <w:color w:val="333333"/>
+          <w:sz w:val="20"/>
+          <w:szCs w:val="20"/>
+        </w:rPr>
+        <w:t xml:space="preserve">Then install and initialise Biome as the linter/formatter for this project.</w:t>
+      </w:r>
+    </w:p>
+    <w:p>
+      <w:pPr>
+        <w:shd w:fill="F0F0F0" w:val="clear"/>
+        <w:spacing w:after="0"/>
+        <w:ind w:left="360"/>
+      </w:pPr>
+      <w:r>
+        <w:rPr>
+          <w:rFonts w:ascii="Courier New" w:cs="Courier New" w:eastAsia="Courier New" w:hAnsi="Courier New"/>
+          <w:color w:val="333333"/>
+          <w:sz w:val="20"/>
+          <w:szCs w:val="20"/>
+        </w:rPr>
+        <w:t xml:space="preserve"/>
+      </w:r>
+    </w:p>
+    <w:p>
+      <w:pPr>
+        <w:shd w:fill="F0F0F0" w:val="clear"/>
+        <w:spacing w:after="0"/>
+        <w:ind w:left="360"/>
+      </w:pPr>
+      <w:r>
+        <w:rPr>
+          <w:rFonts w:ascii="Courier New" w:cs="Courier New" w:eastAsia="Courier New" w:hAnsi="Courier New"/>
+          <w:color w:val="333333"/>
+          <w:sz w:val="20"/>
+          <w:szCs w:val="20"/>
+        </w:rPr>
+        <w:t xml:space="preserve">Finally create a CLAUDE.md file in the root. Give it a clear markdown structure with</w:t>
+      </w:r>
+    </w:p>
+    <w:p>
+      <w:pPr>
+        <w:shd w:fill="F0F0F0" w:val="clear"/>
+        <w:spacing w:after="0"/>
+        <w:ind w:left="360"/>
+      </w:pPr>
+      <w:r>
+        <w:rPr>
+          <w:rFonts w:ascii="Courier New" w:cs="Courier New" w:eastAsia="Courier New" w:hAnsi="Courier New"/>
+          <w:color w:val="333333"/>
+          <w:sz w:val="20"/>
+          <w:szCs w:val="20"/>
+        </w:rPr>
+        <w:t xml:space="preserve">sections like project info, tech stack, requirements, and rules (what is and isn't allowed).</w:t>
+      </w:r>
+    </w:p>
+    <w:p>
+      <w:pPr>
+        <w:shd w:fill="F0F0F0" w:val="clear"/>
+        <w:spacing w:after="0"/>
+        <w:ind w:left="360"/>
+      </w:pPr>
+      <w:r>
+        <w:rPr>
+          <w:rFonts w:ascii="Courier New" w:cs="Courier New" w:eastAsia="Courier New" w:hAnsi="Courier New"/>
+          <w:color w:val="333333"/>
+          <w:sz w:val="20"/>
+          <w:szCs w:val="20"/>
+        </w:rPr>
+        <w:t xml:space="preserve">Base it on the following:</w:t>
+      </w:r>
+    </w:p>
+    <w:p>
+      <w:pPr>
+        <w:shd w:fill="F0F0F0" w:val="clear"/>
+        <w:spacing w:after="0"/>
+        <w:ind w:left="360"/>
+      </w:pPr>
+      <w:r>
+        <w:rPr>
+          <w:rFonts w:ascii="Courier New" w:cs="Courier New" w:eastAsia="Courier New" w:hAnsi="Courier New"/>
+          <w:color w:val="333333"/>
+          <w:sz w:val="20"/>
+          <w:szCs w:val="20"/>
+        </w:rPr>
+        <w:t xml:space="preserve"/>
+      </w:r>
+    </w:p>
+    <w:p>
+      <w:pPr>
+        <w:shd w:fill="F0F0F0" w:val="clear"/>
+        <w:spacing w:after="0"/>
+        <w:ind w:left="360"/>
+      </w:pPr>
+      <w:r>
+        <w:rPr>
+          <w:rFonts w:ascii="Courier New" w:cs="Courier New" w:eastAsia="Courier New" w:hAnsi="Courier New"/>
+          <w:color w:val="333333"/>
+          <w:sz w:val="20"/>
+          <w:szCs w:val="20"/>
+        </w:rPr>
+        <w:t xml:space="preserve">I'm a first-year Applied Informatics student at Odisee (Belgium) working on a project</w:t>
+      </w:r>
+    </w:p>
+    <w:p>
+      <w:pPr>
+        <w:shd w:fill="F0F0F0" w:val="clear"/>
+        <w:spacing w:after="0"/>
+        <w:ind w:left="360"/>
+      </w:pPr>
+      <w:r>
+        <w:rPr>
+          <w:rFonts w:ascii="Courier New" w:cs="Courier New" w:eastAsia="Courier New" w:hAnsi="Courier New"/>
+          <w:color w:val="333333"/>
+          <w:sz w:val="20"/>
+          <w:szCs w:val="20"/>
+        </w:rPr>
+        <w:t xml:space="preserve">for my Dynamic Web Development course. The app is a soundboard that lets users search</w:t>
+      </w:r>
+    </w:p>
+    <w:p>
+      <w:pPr>
+        <w:shd w:fill="F0F0F0" w:val="clear"/>
+        <w:spacing w:after="0"/>
+        <w:ind w:left="360"/>
+      </w:pPr>
+      <w:r>
+        <w:rPr>
+          <w:rFonts w:ascii="Courier New" w:cs="Courier New" w:eastAsia="Courier New" w:hAnsi="Courier New"/>
+          <w:color w:val="333333"/>
+          <w:sz w:val="20"/>
+          <w:szCs w:val="20"/>
+        </w:rPr>
+        <w:t xml:space="preserve">for sound effects via the Freesound.org API, preview and play them, and save favourites</w:t>
+      </w:r>
+    </w:p>
+    <w:p>
+      <w:pPr>
+        <w:shd w:fill="F0F0F0" w:val="clear"/>
+        <w:spacing w:after="0"/>
+        <w:ind w:left="360"/>
+      </w:pPr>
+      <w:r>
+        <w:rPr>
+          <w:rFonts w:ascii="Courier New" w:cs="Courier New" w:eastAsia="Courier New" w:hAnsi="Courier New"/>
+          <w:color w:val="333333"/>
+          <w:sz w:val="20"/>
+          <w:szCs w:val="20"/>
+        </w:rPr>
+        <w:t xml:space="preserve">to a personal dashboard. The dashboard must persist using localStorage. All API calls</w:t>
+      </w:r>
+    </w:p>
+    <w:p>
+      <w:pPr>
+        <w:shd w:fill="F0F0F0" w:val="clear"/>
+        <w:spacing w:after="0"/>
+        <w:ind w:left="360"/>
+      </w:pPr>
+      <w:r>
+        <w:rPr>
+          <w:rFonts w:ascii="Courier New" w:cs="Courier New" w:eastAsia="Courier New" w:hAnsi="Courier New"/>
+          <w:color w:val="333333"/>
+          <w:sz w:val="20"/>
+          <w:szCs w:val="20"/>
+        </w:rPr>
+        <w:t xml:space="preserve">must use fetch with async/await. The app must be responsive. Only vanilla HTML, CSS and</w:t>
+      </w:r>
+    </w:p>
+    <w:p>
+      <w:pPr>
+        <w:shd w:fill="F0F0F0" w:val="clear"/>
+        <w:spacing w:after="0"/>
+        <w:ind w:left="360"/>
+      </w:pPr>
+      <w:r>
+        <w:rPr>
+          <w:rFonts w:ascii="Courier New" w:cs="Courier New" w:eastAsia="Courier New" w:hAnsi="Courier New"/>
+          <w:color w:val="333333"/>
+          <w:sz w:val="20"/>
+          <w:szCs w:val="20"/>
+        </w:rPr>
+        <w:t xml:space="preserve">JavaScript — no frameworks, no Bootstrap, no libraries.</w:t>
+      </w:r>
+    </w:p>
+    <w:p>
+      <w:pPr>
+        <w:shd w:fill="F0F0F0" w:val="clear"/>
+        <w:spacing w:after="0"/>
+        <w:ind w:left="360"/>
+      </w:pPr>
+      <w:r>
+        <w:rPr>
+          <w:rFonts w:ascii="Courier New" w:cs="Courier New" w:eastAsia="Courier New" w:hAnsi="Courier New"/>
+          <w:color w:val="333333"/>
+          <w:sz w:val="20"/>
+          <w:szCs w:val="20"/>
+        </w:rPr>
+        <w:t xml:space="preserve"/>
+      </w:r>
+    </w:p>
+    <w:p>
+      <w:pPr>
+        <w:shd w:fill="F0F0F0" w:val="clear"/>
+        <w:spacing w:after="0"/>
+        <w:ind w:left="360"/>
+      </w:pPr>
+      <w:r>
+        <w:rPr>
+          <w:rFonts w:ascii="Courier New" w:cs="Courier New" w:eastAsia="Courier New" w:hAnsi="Courier New"/>
+          <w:color w:val="333333"/>
+          <w:sz w:val="20"/>
+          <w:szCs w:val="20"/>
+        </w:rPr>
+        <w:t xml:space="preserve">Do not write any application logic yet. This is just the project scaffold.</w:t>
       </w:r>
     </w:p>
     <w:p>
@@ -548,22 +1558,59 @@
         <w:pStyle w:val="Heading2"/>
       </w:pPr>
       <w:r>
-        <w:t xml:space="preserve">2.2 Doel</w:t>
-      </w:r>
-    </w:p>
-    <w:p>
-      <w:pPr>
-        <w:shd w:fill="F5F5F5" w:val="clear"/>
-        <w:spacing w:after="160" w:before="80"/>
-        <w:ind w:left="360"/>
-      </w:pPr>
-      <w:r>
-        <w:rPr>
-          <w:i/>
-          <w:iCs/>
-          <w:color w:val="888888"/>
-        </w:rPr>
-        <w:t xml:space="preserve">→ beschrijf hier het doel dat je meegaf (opdracht, features, gewenst eindresultaat...)</w:t>
+        <w:t xml:space="preserve">2.2 Resultaat</w:t>
+      </w:r>
+    </w:p>
+    <w:p>
+      <w:pPr>
+        <w:pStyle w:val="ListParagraph"/>
+        <w:numPr>
+          <w:ilvl w:val="0"/>
+          <w:numId w:val="2"/>
+        </w:numPr>
+        <w:spacing w:after="80"/>
+      </w:pPr>
+      <w:r>
+        <w:t xml:space="preserve">Projectstructuur aangemaakt (index.html, index.css, index.js, img/, documentatie.docx)</w:t>
+      </w:r>
+    </w:p>
+    <w:p>
+      <w:pPr>
+        <w:pStyle w:val="ListParagraph"/>
+        <w:numPr>
+          <w:ilvl w:val="0"/>
+          <w:numId w:val="2"/>
+        </w:numPr>
+        <w:spacing w:after="80"/>
+      </w:pPr>
+      <w:r>
+        <w:t xml:space="preserve">Biome geïnstalleerd en geconfigureerd (biome.json, package.json scripts)</w:t>
+      </w:r>
+    </w:p>
+    <w:p>
+      <w:pPr>
+        <w:pStyle w:val="ListParagraph"/>
+        <w:numPr>
+          <w:ilvl w:val="0"/>
+          <w:numId w:val="2"/>
+        </w:numPr>
+        <w:spacing w:after="80"/>
+      </w:pPr>
+      <w:r>
+        <w:t xml:space="preserve">CLAUDE.md aangemaakt met gestructureerde secties</w:t>
+      </w:r>
+    </w:p>
+    <w:p>
+      <w:pPr>
+        <w:pStyle w:val="ListParagraph"/>
+        <w:numPr>
+          <w:ilvl w:val="0"/>
+          <w:numId w:val="2"/>
+        </w:numPr>
+        <w:spacing w:after="80"/>
+      </w:pPr>
+      <w:r>
+        <w:t xml:space="preserve">Commit: feat: initial project scaffold</w:t>
       </w:r>
     </w:p>
     <w:p>
@@ -576,25 +1623,99 @@
     </w:p>
     <w:p>
       <w:pPr>
+        <w:pStyle w:val="Heading1"/>
+      </w:pPr>
+      <w:r>
+        <w:t xml:space="preserve">3. Plan van aanpak</w:t>
+      </w:r>
+    </w:p>
+    <w:p>
+      <w:pPr>
+        <w:spacing w:after="120"/>
+      </w:pPr>
+      <w:r>
+        <w:t xml:space="preserve">Het plan van aanpak werd vooraf bepaald op basis van de vereiste functionaliteit uit de opdracht.</w:t>
+      </w:r>
+    </w:p>
+    <w:p>
+      <w:pPr>
+        <w:spacing w:after="120"/>
+      </w:pPr>
+      <w:r>
+        <w:t xml:space="preserve"/>
+      </w:r>
+    </w:p>
+    <w:p>
+      <w:pPr>
         <w:pStyle w:val="Heading2"/>
       </w:pPr>
       <w:r>
-        <w:t xml:space="preserve">2.3 Beperkingen</w:t>
-      </w:r>
-    </w:p>
-    <w:p>
-      <w:pPr>
-        <w:shd w:fill="F5F5F5" w:val="clear"/>
-        <w:spacing w:after="160" w:before="80"/>
-        <w:ind w:left="360"/>
-      </w:pPr>
-      <w:r>
-        <w:rPr>
-          <w:i/>
-          <w:iCs/>
-          <w:color w:val="888888"/>
-        </w:rPr>
-        <w:t xml:space="preserve">→ beschrijf hier de beperkingen die je meegaf (vanilla JS, geen frameworks, fetch API, localStorage...)</w:t>
+        <w:t xml:space="preserve">3.1 Commit plan</w:t>
+      </w:r>
+    </w:p>
+    <w:p>
+      <w:pPr>
+        <w:pStyle w:val="ListParagraph"/>
+        <w:numPr>
+          <w:ilvl w:val="0"/>
+          <w:numId w:val="3"/>
+        </w:numPr>
+        <w:spacing w:after="80"/>
+      </w:pPr>
+      <w:r>
+        <w:t xml:space="preserve">feat: initial project scaffold — bestandsstructuur, Biome, CLAUDE.md</w:t>
+      </w:r>
+    </w:p>
+    <w:p>
+      <w:pPr>
+        <w:pStyle w:val="ListParagraph"/>
+        <w:numPr>
+          <w:ilvl w:val="0"/>
+          <w:numId w:val="3"/>
+        </w:numPr>
+        <w:spacing w:after="80"/>
+      </w:pPr>
+      <w:r>
+        <w:t xml:space="preserve">feat: design &amp; layout — HTML-structuur, glassmorphism CSS, achtergrondafbeelding, responsive grid</w:t>
+      </w:r>
+    </w:p>
+    <w:p>
+      <w:pPr>
+        <w:pStyle w:val="ListParagraph"/>
+        <w:numPr>
+          <w:ilvl w:val="0"/>
+          <w:numId w:val="3"/>
+        </w:numPr>
+        <w:spacing w:after="80"/>
+      </w:pPr>
+      <w:r>
+        <w:t xml:space="preserve">feat: freesound API &amp; zoekfunctie — fetch, resultaten renderen in de bestaande UI</w:t>
+      </w:r>
+    </w:p>
+    <w:p>
+      <w:pPr>
+        <w:pStyle w:val="ListParagraph"/>
+        <w:numPr>
+          <w:ilvl w:val="0"/>
+          <w:numId w:val="3"/>
+        </w:numPr>
+        <w:spacing w:after="80"/>
+      </w:pPr>
+      <w:r>
+        <w:t xml:space="preserve">feat: audio playback &amp; UI feedback — play/stop, actieve staat, voortgangsbalk</w:t>
+      </w:r>
+    </w:p>
+    <w:p>
+      <w:pPr>
+        <w:pStyle w:val="ListParagraph"/>
+        <w:numPr>
+          <w:ilvl w:val="0"/>
+          <w:numId w:val="3"/>
+        </w:numPr>
+        <w:spacing w:after="80"/>
+      </w:pPr>
+      <w:r>
+        <w:t xml:space="preserve">feat: dashboard &amp; localStorage — opslaan, verwijderen, persistentie</w:t>
       </w:r>
     </w:p>
     <w:p>
@@ -610,22 +1731,7 @@
         <w:pStyle w:val="Heading2"/>
       </w:pPr>
       <w:r>
-        <w:t xml:space="preserve">2.4 Volledige prompt</w:t>
-      </w:r>
-    </w:p>
-    <w:p>
-      <w:pPr>
-        <w:shd w:fill="F5F5F5" w:val="clear"/>
-        <w:spacing w:after="160" w:before="80"/>
-        <w:ind w:left="360"/>
-      </w:pPr>
-      <w:r>
-        <w:rPr>
-          <w:i/>
-          <w:iCs/>
-          <w:color w:val="888888"/>
-        </w:rPr>
-        <w:t xml:space="preserve">→ plak hier de volledige initiële prompt zoals je die aan de agent hebt gegeven</w:t>
+        <w:t xml:space="preserve">3.2 Afwijkingen van het plan</w:t>
       </w:r>
     </w:p>
     <w:p>
@@ -633,85 +1739,7 @@
         <w:spacing w:after="120"/>
       </w:pPr>
       <w:r>
-        <w:t xml:space="preserve"/>
-      </w:r>
-    </w:p>
-    <w:p>
-      <w:pPr>
-        <w:pStyle w:val="Heading1"/>
-      </w:pPr>
-      <w:r>
-        <w:t xml:space="preserve">3. Plan van aanpak</w:t>
-      </w:r>
-    </w:p>
-    <w:p>
-      <w:pPr>
-        <w:spacing w:after="120"/>
-      </w:pPr>
-      <w:r>
-        <w:t xml:space="preserve">Het plan van aanpak werd gegenereerd door de AI-agent in plan mode, vóór de eigenlijke implementatie.</w:t>
-      </w:r>
-    </w:p>
-    <w:p>
-      <w:pPr>
-        <w:spacing w:after="120"/>
-      </w:pPr>
-      <w:r>
-        <w:t xml:space="preserve"/>
-      </w:r>
-    </w:p>
-    <w:p>
-      <w:pPr>
-        <w:pStyle w:val="Heading2"/>
-      </w:pPr>
-      <w:r>
-        <w:t xml:space="preserve">3.1 Gegenereerd plan</w:t>
-      </w:r>
-    </w:p>
-    <w:p>
-      <w:pPr>
-        <w:shd w:fill="F5F5F5" w:val="clear"/>
-        <w:spacing w:after="160" w:before="80"/>
-        <w:ind w:left="360"/>
-      </w:pPr>
-      <w:r>
-        <w:rPr>
-          <w:i/>
-          <w:iCs/>
-          <w:color w:val="888888"/>
-        </w:rPr>
-        <w:t xml:space="preserve">→ plak hier het plan dat de agent in plan mode heeft opgesteld</w:t>
-      </w:r>
-    </w:p>
-    <w:p>
-      <w:pPr>
-        <w:spacing w:after="120"/>
-      </w:pPr>
-      <w:r>
-        <w:t xml:space="preserve"/>
-      </w:r>
-    </w:p>
-    <w:p>
-      <w:pPr>
-        <w:pStyle w:val="Heading2"/>
-      </w:pPr>
-      <w:r>
-        <w:t xml:space="preserve">3.2 Afwijkingen van het plan</w:t>
-      </w:r>
-    </w:p>
-    <w:p>
-      <w:pPr>
-        <w:shd w:fill="F5F5F5" w:val="clear"/>
-        <w:spacing w:after="160" w:before="80"/>
-        <w:ind w:left="360"/>
-      </w:pPr>
-      <w:r>
-        <w:rPr>
-          <w:i/>
-          <w:iCs/>
-          <w:color w:val="888888"/>
-        </w:rPr>
-        <w:t xml:space="preserve">→ beschrijf hier eventuele afwijkingen t.o.v. het oorspronkelijke plan (optioneel)</w:t>
+        <w:t xml:space="preserve">Er is bewust gekozen om de design- en layoutfase vóór de functionaliteit te plaatsen, zodat de visuele structuur als basis kon dienen voor de verdere implementatie.</w:t>
       </w:r>
     </w:p>
     <w:p>
@@ -879,13 +1907,13 @@
           <w:p>
             <w:r>
               <w:rPr>
-                <w:i/>
-                <w:iCs/>
-                <w:color w:val="888888"/>
-                <w:sz w:val="22"/>
-                <w:szCs w:val="22"/>
-              </w:rPr>
-              <w:t xml:space="preserve">→ vul in</w:t>
+                <w:i w:val="false"/>
+                <w:iCs w:val="false"/>
+                <w:color w:val="000000"/>
+                <w:sz w:val="22"/>
+                <w:szCs w:val="22"/>
+              </w:rPr>
+              <w:t xml:space="preserve">Projectstructuur, Biome installatie, CLAUDE.md opstellen</w:t>
             </w:r>
           </w:p>
         </w:tc>
@@ -939,13 +1967,13 @@
           <w:p>
             <w:r>
               <w:rPr>
-                <w:i/>
-                <w:iCs/>
-                <w:color w:val="888888"/>
-                <w:sz w:val="22"/>
-                <w:szCs w:val="22"/>
-              </w:rPr>
-              <w:t xml:space="preserve">→ vul in (bv. Claude Code, Cursor)</w:t>
+                <w:i w:val="false"/>
+                <w:iCs w:val="false"/>
+                <w:color w:val="000000"/>
+                <w:sz w:val="22"/>
+                <w:szCs w:val="22"/>
+              </w:rPr>
+              <w:t xml:space="preserve">Claude Code</w:t>
             </w:r>
           </w:p>
         </w:tc>
@@ -999,13 +2027,13 @@
           <w:p>
             <w:r>
               <w:rPr>
-                <w:i/>
-                <w:iCs/>
-                <w:color w:val="888888"/>
-                <w:sz w:val="22"/>
-                <w:szCs w:val="22"/>
-              </w:rPr>
-              <w:t xml:space="preserve">→ plan / ask / edit</w:t>
+                <w:i w:val="false"/>
+                <w:iCs w:val="false"/>
+                <w:color w:val="000000"/>
+                <w:sz w:val="22"/>
+                <w:szCs w:val="22"/>
+              </w:rPr>
+              <w:t xml:space="preserve">edit</w:t>
             </w:r>
           </w:p>
         </w:tc>
@@ -1059,13 +2087,10 @@
           <w:p>
             <w:r>
               <w:rPr>
-                <w:i/>
-                <w:iCs/>
-                <w:color w:val="888888"/>
-                <w:sz w:val="22"/>
-                <w:szCs w:val="22"/>
-              </w:rPr>
-              <w:t xml:space="preserve">→ vul in</w:t>
+                <w:sz w:val="22"/>
+                <w:szCs w:val="22"/>
+              </w:rPr>
+              <w:t xml:space="preserve">Zie sectie 2.1 — initiële prompt</w:t>
             </w:r>
           </w:p>
         </w:tc>
@@ -1119,13 +2144,13 @@
           <w:p>
             <w:r>
               <w:rPr>
-                <w:i/>
-                <w:iCs/>
-                <w:color w:val="888888"/>
-                <w:sz w:val="22"/>
-                <w:szCs w:val="22"/>
-              </w:rPr>
-              <w:t xml:space="preserve">→ vul in</w:t>
+                <w:i w:val="false"/>
+                <w:iCs w:val="false"/>
+                <w:color w:val="000000"/>
+                <w:sz w:val="22"/>
+                <w:szCs w:val="22"/>
+              </w:rPr>
+              <w:t xml:space="preserve">/</w:t>
             </w:r>
           </w:p>
         </w:tc>
@@ -1179,13 +2204,13 @@
           <w:p>
             <w:r>
               <w:rPr>
-                <w:i/>
-                <w:iCs/>
-                <w:color w:val="888888"/>
-                <w:sz w:val="22"/>
-                <w:szCs w:val="22"/>
-              </w:rPr>
-              <w:t xml:space="preserve">→ vul in</w:t>
+                <w:i w:val="false"/>
+                <w:iCs w:val="false"/>
+                <w:color w:val="000000"/>
+                <w:sz w:val="22"/>
+                <w:szCs w:val="22"/>
+              </w:rPr>
+              <w:t xml:space="preserve">Scaffold aangemaakt, Biome geconfigureerd, CLAUDE.md opgesteld. Commit: feat: initial project scaffold</w:t>
             </w:r>
           </w:p>
         </w:tc>
@@ -1204,7 +2229,7 @@
         <w:pStyle w:val="Heading2"/>
       </w:pPr>
       <w:r>
-        <w:t xml:space="preserve">Agent 2 — Freesound API &amp; zoekfunctie</w:t>
+        <w:t xml:space="preserve">Agent 2 — Design &amp; layout</w:t>
       </w:r>
     </w:p>
     <w:tbl>
@@ -1332,13 +2357,13 @@
           <w:p>
             <w:r>
               <w:rPr>
-                <w:i/>
-                <w:iCs/>
-                <w:color w:val="888888"/>
-                <w:sz w:val="22"/>
-                <w:szCs w:val="22"/>
-              </w:rPr>
-              <w:t xml:space="preserve">→ vul in</w:t>
+                <w:i w:val="false"/>
+                <w:iCs w:val="false"/>
+                <w:color w:val="000000"/>
+                <w:sz w:val="22"/>
+                <w:szCs w:val="22"/>
+              </w:rPr>
+              <w:t xml:space="preserve">Volledige HTML-structuur en CSS-stijl — glassmorphism layout, achtergrondafbeelding, now playing banner, favourites sectie</w:t>
             </w:r>
           </w:p>
         </w:tc>
@@ -1392,13 +2417,13 @@
           <w:p>
             <w:r>
               <w:rPr>
-                <w:i/>
-                <w:iCs/>
-                <w:color w:val="888888"/>
-                <w:sz w:val="22"/>
-                <w:szCs w:val="22"/>
-              </w:rPr>
-              <w:t xml:space="preserve">→ vul in (bv. Claude Code, Cursor)</w:t>
+                <w:i w:val="false"/>
+                <w:iCs w:val="false"/>
+                <w:color w:val="000000"/>
+                <w:sz w:val="22"/>
+                <w:szCs w:val="22"/>
+              </w:rPr>
+              <w:t xml:space="preserve">Claude Code</w:t>
             </w:r>
           </w:p>
         </w:tc>
@@ -1452,13 +2477,13 @@
           <w:p>
             <w:r>
               <w:rPr>
-                <w:i/>
-                <w:iCs/>
-                <w:color w:val="888888"/>
-                <w:sz w:val="22"/>
-                <w:szCs w:val="22"/>
-              </w:rPr>
-              <w:t xml:space="preserve">→ plan / ask / edit</w:t>
+                <w:i w:val="false"/>
+                <w:iCs w:val="false"/>
+                <w:color w:val="000000"/>
+                <w:sz w:val="22"/>
+                <w:szCs w:val="22"/>
+              </w:rPr>
+              <w:t xml:space="preserve">edit</w:t>
             </w:r>
           </w:p>
         </w:tc>
@@ -1510,15 +2535,15 @@
             </w:tcMar>
           </w:tcPr>
           <w:p>
-            <w:r>
-              <w:rPr>
-                <w:i/>
-                <w:iCs/>
-                <w:color w:val="888888"/>
-                <w:sz w:val="22"/>
-                <w:szCs w:val="22"/>
-              </w:rPr>
-              <w:t xml:space="preserve">→ vul in</w:t>
+            <w:pPr>
+              <w:spacing w:after="60"/>
+            </w:pPr>
+            <w:r>
+              <w:rPr>
+                <w:sz w:val="22"/>
+                <w:szCs w:val="22"/>
+              </w:rPr>
+              <w:t xml:space="preserve">Zie designprompt hieronder (sectie 4.1).</w:t>
             </w:r>
           </w:p>
         </w:tc>
@@ -1570,15 +2595,117 @@
             </w:tcMar>
           </w:tcPr>
           <w:p>
-            <w:r>
-              <w:rPr>
-                <w:i/>
-                <w:iCs/>
-                <w:color w:val="888888"/>
-                <w:sz w:val="22"/>
-                <w:szCs w:val="22"/>
-              </w:rPr>
-              <w:t xml:space="preserve">→ vul in</w:t>
+            <w:pPr>
+              <w:spacing w:after="40"/>
+            </w:pPr>
+            <w:r>
+              <w:rPr>
+                <w:sz w:val="22"/>
+                <w:szCs w:val="22"/>
+              </w:rPr>
+              <w:t xml:space="preserve">Na de output zijn volgende aanpassingen manueel gedaan:</w:t>
+            </w:r>
+          </w:p>
+          <w:p>
+            <w:pPr>
+              <w:pStyle w:val="ListParagraph"/>
+              <w:numPr>
+                <w:ilvl w:val="0"/>
+                <w:numId w:val="2"/>
+              </w:numPr>
+              <w:spacing w:after="40"/>
+            </w:pPr>
+            <w:r>
+              <w:rPr>
+                <w:sz w:val="22"/>
+                <w:szCs w:val="22"/>
+              </w:rPr>
+              <w:t xml:space="preserve">Geanimeerde blobs verwijderd — buiten scope van de opdracht.</w:t>
+            </w:r>
+          </w:p>
+          <w:p>
+            <w:pPr>
+              <w:pStyle w:val="ListParagraph"/>
+              <w:numPr>
+                <w:ilvl w:val="0"/>
+                <w:numId w:val="2"/>
+              </w:numPr>
+              <w:spacing w:after="40"/>
+            </w:pPr>
+            <w:r>
+              <w:rPr>
+                <w:sz w:val="22"/>
+                <w:szCs w:val="22"/>
+              </w:rPr>
+              <w:t xml:space="preserve">Gap tussen de twee panels gesloten; border-radius enkel op de buitenhoeken behouden.</w:t>
+            </w:r>
+          </w:p>
+          <w:p>
+            <w:pPr>
+              <w:pStyle w:val="ListParagraph"/>
+              <w:numPr>
+                <w:ilvl w:val="0"/>
+                <w:numId w:val="2"/>
+              </w:numPr>
+              <w:spacing w:after="40"/>
+            </w:pPr>
+            <w:r>
+              <w:rPr>
+                <w:sz w:val="22"/>
+                <w:szCs w:val="22"/>
+              </w:rPr>
+              <w:t xml:space="preserve">Geanimeerde geluidsgolf in banner verwijderd — niet vereist.</w:t>
+            </w:r>
+          </w:p>
+          <w:p>
+            <w:pPr>
+              <w:pStyle w:val="ListParagraph"/>
+              <w:numPr>
+                <w:ilvl w:val="0"/>
+                <w:numId w:val="2"/>
+              </w:numPr>
+              <w:spacing w:after="40"/>
+            </w:pPr>
+            <w:r>
+              <w:rPr>
+                <w:sz w:val="22"/>
+                <w:szCs w:val="22"/>
+              </w:rPr>
+              <w:t xml:space="preserve">Lege-staat berichten toegevoegd aan zoekresultaten en favourites voor betere UX.</w:t>
+            </w:r>
+          </w:p>
+          <w:p>
+            <w:pPr>
+              <w:pStyle w:val="ListParagraph"/>
+              <w:numPr>
+                <w:ilvl w:val="0"/>
+                <w:numId w:val="2"/>
+              </w:numPr>
+              <w:spacing w:after="40"/>
+            </w:pPr>
+            <w:r>
+              <w:rPr>
+                <w:sz w:val="22"/>
+                <w:szCs w:val="22"/>
+              </w:rPr>
+              <w:t xml:space="preserve">Hungarian notation gevraagd aan Claude voor alle variabelenamen; CLAUDE.md bijgewerkt.</w:t>
+            </w:r>
+          </w:p>
+          <w:p>
+            <w:pPr>
+              <w:pStyle w:val="ListParagraph"/>
+              <w:numPr>
+                <w:ilvl w:val="0"/>
+                <w:numId w:val="2"/>
+              </w:numPr>
+              <w:spacing w:after="40"/>
+            </w:pPr>
+            <w:r>
+              <w:rPr>
+                <w:sz w:val="22"/>
+                <w:szCs w:val="22"/>
+              </w:rPr>
+              <w:t xml:space="preserve">aria-labels verwijderd uit de HTML.</w:t>
             </w:r>
           </w:p>
         </w:tc>
@@ -1632,13 +2759,13 @@
           <w:p>
             <w:r>
               <w:rPr>
-                <w:i/>
-                <w:iCs/>
-                <w:color w:val="888888"/>
-                <w:sz w:val="22"/>
-                <w:szCs w:val="22"/>
-              </w:rPr>
-              <w:t xml:space="preserve">→ vul in</w:t>
+                <w:i w:val="false"/>
+                <w:iCs w:val="false"/>
+                <w:color w:val="000000"/>
+                <w:sz w:val="22"/>
+                <w:szCs w:val="22"/>
+              </w:rPr>
+              <w:t xml:space="preserve">Volledige UI-layout klaar. Commit: feat: design &amp; layout</w:t>
             </w:r>
           </w:p>
         </w:tc>
@@ -1657,7 +2784,295 @@
         <w:pStyle w:val="Heading2"/>
       </w:pPr>
       <w:r>
-        <w:t xml:space="preserve">Agent 3 — Afspelen van geluid &amp; UI feedback</w:t>
+        <w:t xml:space="preserve">4.1 Designprompt (Agent 2)</w:t>
+      </w:r>
+    </w:p>
+    <w:p>
+      <w:pPr>
+        <w:shd w:fill="F0F0F0" w:val="clear"/>
+        <w:spacing w:after="0"/>
+        <w:ind w:left="360"/>
+      </w:pPr>
+      <w:r>
+        <w:rPr>
+          <w:rFonts w:ascii="Courier New" w:cs="Courier New" w:eastAsia="Courier New" w:hAnsi="Courier New"/>
+          <w:color w:val="333333"/>
+          <w:sz w:val="20"/>
+          <w:szCs w:val="20"/>
+        </w:rPr>
+        <w:t xml:space="preserve">I committed everything. The next step is the design. I added two images to the img/</w:t>
+      </w:r>
+    </w:p>
+    <w:p>
+      <w:pPr>
+        <w:shd w:fill="F0F0F0" w:val="clear"/>
+        <w:spacing w:after="0"/>
+        <w:ind w:left="360"/>
+      </w:pPr>
+      <w:r>
+        <w:rPr>
+          <w:rFonts w:ascii="Courier New" w:cs="Courier New" w:eastAsia="Courier New" w:hAnsi="Courier New"/>
+          <w:color w:val="333333"/>
+          <w:sz w:val="20"/>
+          <w:szCs w:val="20"/>
+        </w:rPr>
+        <w:t xml:space="preserve">folder — use one as a full-screen background cover.</w:t>
+      </w:r>
+    </w:p>
+    <w:p>
+      <w:pPr>
+        <w:shd w:fill="F0F0F0" w:val="clear"/>
+        <w:spacing w:after="0"/>
+        <w:ind w:left="360"/>
+      </w:pPr>
+      <w:r>
+        <w:rPr>
+          <w:rFonts w:ascii="Courier New" w:cs="Courier New" w:eastAsia="Courier New" w:hAnsi="Courier New"/>
+          <w:color w:val="333333"/>
+          <w:sz w:val="20"/>
+          <w:szCs w:val="20"/>
+        </w:rPr>
+        <w:t xml:space="preserve"/>
+      </w:r>
+    </w:p>
+    <w:p>
+      <w:pPr>
+        <w:shd w:fill="F0F0F0" w:val="clear"/>
+        <w:spacing w:after="0"/>
+        <w:ind w:left="360"/>
+      </w:pPr>
+      <w:r>
+        <w:rPr>
+          <w:rFonts w:ascii="Courier New" w:cs="Courier New" w:eastAsia="Courier New" w:hAnsi="Courier New"/>
+          <w:color w:val="333333"/>
+          <w:sz w:val="20"/>
+          <w:szCs w:val="20"/>
+        </w:rPr>
+        <w:t xml:space="preserve">Build the UI layout based on the reference image. Two glass-style panels side by side:</w:t>
+      </w:r>
+    </w:p>
+    <w:p>
+      <w:pPr>
+        <w:shd w:fill="F0F0F0" w:val="clear"/>
+        <w:spacing w:after="0"/>
+        <w:ind w:left="360"/>
+      </w:pPr>
+      <w:r>
+        <w:rPr>
+          <w:rFonts w:ascii="Courier New" w:cs="Courier New" w:eastAsia="Courier New" w:hAnsi="Courier New"/>
+          <w:color w:val="333333"/>
+          <w:sz w:val="20"/>
+          <w:szCs w:val="20"/>
+        </w:rPr>
+        <w:t xml:space="preserve"/>
+      </w:r>
+    </w:p>
+    <w:p>
+      <w:pPr>
+        <w:shd w:fill="F0F0F0" w:val="clear"/>
+        <w:spacing w:after="0"/>
+        <w:ind w:left="360"/>
+      </w:pPr>
+      <w:r>
+        <w:rPr>
+          <w:rFonts w:ascii="Courier New" w:cs="Courier New" w:eastAsia="Courier New" w:hAnsi="Courier New"/>
+          <w:color w:val="333333"/>
+          <w:sz w:val="20"/>
+          <w:szCs w:val="20"/>
+        </w:rPr>
+        <w:t xml:space="preserve">Left panel: project name 'soundboard' at the top, a search bar below it, and an empty</w:t>
+      </w:r>
+    </w:p>
+    <w:p>
+      <w:pPr>
+        <w:shd w:fill="F0F0F0" w:val="clear"/>
+        <w:spacing w:after="0"/>
+        <w:ind w:left="360"/>
+      </w:pPr>
+      <w:r>
+        <w:rPr>
+          <w:rFonts w:ascii="Courier New" w:cs="Courier New" w:eastAsia="Courier New" w:hAnsi="Courier New"/>
+          <w:color w:val="333333"/>
+          <w:sz w:val="20"/>
+          <w:szCs w:val="20"/>
+        </w:rPr>
+        <w:t xml:space="preserve">list underneath (will be filled dynamically with JS later).</w:t>
+      </w:r>
+    </w:p>
+    <w:p>
+      <w:pPr>
+        <w:shd w:fill="F0F0F0" w:val="clear"/>
+        <w:spacing w:after="0"/>
+        <w:ind w:left="360"/>
+      </w:pPr>
+      <w:r>
+        <w:rPr>
+          <w:rFonts w:ascii="Courier New" w:cs="Courier New" w:eastAsia="Courier New" w:hAnsi="Courier New"/>
+          <w:color w:val="333333"/>
+          <w:sz w:val="20"/>
+          <w:szCs w:val="20"/>
+        </w:rPr>
+        <w:t xml:space="preserve"/>
+      </w:r>
+    </w:p>
+    <w:p>
+      <w:pPr>
+        <w:shd w:fill="F0F0F0" w:val="clear"/>
+        <w:spacing w:after="0"/>
+        <w:ind w:left="360"/>
+      </w:pPr>
+      <w:r>
+        <w:rPr>
+          <w:rFonts w:ascii="Courier New" w:cs="Courier New" w:eastAsia="Courier New" w:hAnsi="Courier New"/>
+          <w:color w:val="333333"/>
+          <w:sz w:val="20"/>
+          <w:szCs w:val="20"/>
+        </w:rPr>
+        <w:t xml:space="preserve">Right panel: a large banner at the top showing the current/last selected sound — display</w:t>
+      </w:r>
+    </w:p>
+    <w:p>
+      <w:pPr>
+        <w:shd w:fill="F0F0F0" w:val="clear"/>
+        <w:spacing w:after="0"/>
+        <w:ind w:left="360"/>
+      </w:pPr>
+      <w:r>
+        <w:rPr>
+          <w:rFonts w:ascii="Courier New" w:cs="Courier New" w:eastAsia="Courier New" w:hAnsi="Courier New"/>
+          <w:color w:val="333333"/>
+          <w:sz w:val="20"/>
+          <w:szCs w:val="20"/>
+        </w:rPr>
+        <w:t xml:space="preserve">the title, who posted it, and a sound waveform on the right side instead of an image.</w:t>
+      </w:r>
+    </w:p>
+    <w:p>
+      <w:pPr>
+        <w:shd w:fill="F0F0F0" w:val="clear"/>
+        <w:spacing w:after="0"/>
+        <w:ind w:left="360"/>
+      </w:pPr>
+      <w:r>
+        <w:rPr>
+          <w:rFonts w:ascii="Courier New" w:cs="Courier New" w:eastAsia="Courier New" w:hAnsi="Courier New"/>
+          <w:color w:val="333333"/>
+          <w:sz w:val="20"/>
+          <w:szCs w:val="20"/>
+        </w:rPr>
+        <w:t xml:space="preserve">Below the banner, a favourites section showing sounds saved by the user.</w:t>
+      </w:r>
+    </w:p>
+    <w:p>
+      <w:pPr>
+        <w:shd w:fill="F0F0F0" w:val="clear"/>
+        <w:spacing w:after="0"/>
+        <w:ind w:left="360"/>
+      </w:pPr>
+      <w:r>
+        <w:rPr>
+          <w:rFonts w:ascii="Courier New" w:cs="Courier New" w:eastAsia="Courier New" w:hAnsi="Courier New"/>
+          <w:color w:val="333333"/>
+          <w:sz w:val="20"/>
+          <w:szCs w:val="20"/>
+        </w:rPr>
+        <w:t xml:space="preserve"/>
+      </w:r>
+    </w:p>
+    <w:p>
+      <w:pPr>
+        <w:shd w:fill="F0F0F0" w:val="clear"/>
+        <w:spacing w:after="0"/>
+        <w:ind w:left="360"/>
+      </w:pPr>
+      <w:r>
+        <w:rPr>
+          <w:rFonts w:ascii="Courier New" w:cs="Courier New" w:eastAsia="Courier New" w:hAnsi="Courier New"/>
+          <w:color w:val="333333"/>
+          <w:sz w:val="20"/>
+          <w:szCs w:val="20"/>
+        </w:rPr>
+        <w:t xml:space="preserve">Style: dark glassmorphism — frosted glass panels using backdrop-filter: blur() and</w:t>
+      </w:r>
+    </w:p>
+    <w:p>
+      <w:pPr>
+        <w:shd w:fill="F0F0F0" w:val="clear"/>
+        <w:spacing w:after="0"/>
+        <w:ind w:left="360"/>
+      </w:pPr>
+      <w:r>
+        <w:rPr>
+          <w:rFonts w:ascii="Courier New" w:cs="Courier New" w:eastAsia="Courier New" w:hAnsi="Courier New"/>
+          <w:color w:val="333333"/>
+          <w:sz w:val="20"/>
+          <w:szCs w:val="20"/>
+        </w:rPr>
+        <w:t xml:space="preserve">semi-transparent backgrounds, with the background image visible through the panels.</w:t>
+      </w:r>
+    </w:p>
+    <w:p>
+      <w:pPr>
+        <w:shd w:fill="F0F0F0" w:val="clear"/>
+        <w:spacing w:after="0"/>
+        <w:ind w:left="360"/>
+      </w:pPr>
+      <w:r>
+        <w:rPr>
+          <w:rFonts w:ascii="Courier New" w:cs="Courier New" w:eastAsia="Courier New" w:hAnsi="Courier New"/>
+          <w:color w:val="333333"/>
+          <w:sz w:val="20"/>
+          <w:szCs w:val="20"/>
+        </w:rPr>
+        <w:t xml:space="preserve">Animated background blobs using CSS keyframes.</w:t>
+      </w:r>
+    </w:p>
+    <w:p>
+      <w:pPr>
+        <w:shd w:fill="F0F0F0" w:val="clear"/>
+        <w:spacing w:after="0"/>
+        <w:ind w:left="360"/>
+      </w:pPr>
+      <w:r>
+        <w:rPr>
+          <w:rFonts w:ascii="Courier New" w:cs="Courier New" w:eastAsia="Courier New" w:hAnsi="Courier New"/>
+          <w:color w:val="333333"/>
+          <w:sz w:val="20"/>
+          <w:szCs w:val="20"/>
+        </w:rPr>
+        <w:t xml:space="preserve"/>
+      </w:r>
+    </w:p>
+    <w:p>
+      <w:pPr>
+        <w:shd w:fill="F0F0F0" w:val="clear"/>
+        <w:spacing w:after="0"/>
+        <w:ind w:left="360"/>
+      </w:pPr>
+      <w:r>
+        <w:rPr>
+          <w:rFonts w:ascii="Courier New" w:cs="Courier New" w:eastAsia="Courier New" w:hAnsi="Courier New"/>
+          <w:color w:val="333333"/>
+          <w:sz w:val="20"/>
+          <w:szCs w:val="20"/>
+        </w:rPr>
+        <w:t xml:space="preserve">HTML structure and CSS only. No JavaScript logic yet.</w:t>
+      </w:r>
+    </w:p>
+    <w:p>
+      <w:pPr>
+        <w:spacing w:after="120"/>
+      </w:pPr>
+      <w:r>
+        <w:t xml:space="preserve"/>
+      </w:r>
+    </w:p>
+    <w:p>
+      <w:pPr>
+        <w:pStyle w:val="Heading2"/>
+      </w:pPr>
+      <w:r>
+        <w:t xml:space="preserve">Agent 3 — Freesound API &amp; zoekfunctie</w:t>
       </w:r>
     </w:p>
     <w:tbl>
@@ -1845,13 +3260,73 @@
           <w:p>
             <w:r>
               <w:rPr>
+                <w:i w:val="false"/>
+                <w:iCs w:val="false"/>
+                <w:color w:val="000000"/>
+                <w:sz w:val="22"/>
+                <w:szCs w:val="22"/>
+              </w:rPr>
+              <w:t xml:space="preserve">Claude Code</w:t>
+            </w:r>
+          </w:p>
+        </w:tc>
+      </w:tr>
+      <w:tr>
+        <w:tc>
+          <w:tcPr>
+            <w:tcW w:type="dxa" w:w="2500"/>
+            <w:tcBorders>
+              <w:top w:val="single" w:color="CCCCCC" w:sz="1"/>
+              <w:left w:val="single" w:color="CCCCCC" w:sz="1"/>
+              <w:bottom w:val="single" w:color="CCCCCC" w:sz="1"/>
+              <w:right w:val="single" w:color="CCCCCC" w:sz="1"/>
+            </w:tcBorders>
+            <w:shd w:fill="EEF3FA" w:val="clear"/>
+            <w:tcMar>
+              <w:top w:type="dxa" w:w="80"/>
+              <w:left w:type="dxa" w:w="120"/>
+              <w:bottom w:type="dxa" w:w="80"/>
+              <w:right w:type="dxa" w:w="120"/>
+            </w:tcMar>
+          </w:tcPr>
+          <w:p>
+            <w:r>
+              <w:rPr>
+                <w:b/>
+                <w:bCs/>
+                <w:sz w:val="22"/>
+                <w:szCs w:val="22"/>
+              </w:rPr>
+              <w:t xml:space="preserve">Modus</w:t>
+            </w:r>
+          </w:p>
+        </w:tc>
+        <w:tc>
+          <w:tcPr>
+            <w:tcW w:type="dxa" w:w="6526"/>
+            <w:tcBorders>
+              <w:top w:val="single" w:color="CCCCCC" w:sz="1"/>
+              <w:left w:val="single" w:color="CCCCCC" w:sz="1"/>
+              <w:bottom w:val="single" w:color="CCCCCC" w:sz="1"/>
+              <w:right w:val="single" w:color="CCCCCC" w:sz="1"/>
+            </w:tcBorders>
+            <w:tcMar>
+              <w:top w:type="dxa" w:w="80"/>
+              <w:left w:type="dxa" w:w="120"/>
+              <w:bottom w:type="dxa" w:w="80"/>
+              <w:right w:type="dxa" w:w="120"/>
+            </w:tcMar>
+          </w:tcPr>
+          <w:p>
+            <w:r>
+              <w:rPr>
                 <w:i/>
                 <w:iCs/>
                 <w:color w:val="888888"/>
                 <w:sz w:val="22"/>
                 <w:szCs w:val="22"/>
               </w:rPr>
-              <w:t xml:space="preserve">→ vul in (bv. Claude Code, Cursor)</w:t>
+              <w:t xml:space="preserve">→ edit</w:t>
             </w:r>
           </w:p>
         </w:tc>
@@ -1882,7 +3357,7 @@
                 <w:sz w:val="22"/>
                 <w:szCs w:val="22"/>
               </w:rPr>
-              <w:t xml:space="preserve">Modus</w:t>
+              <w:t xml:space="preserve">Prompts gesteld</w:t>
             </w:r>
           </w:p>
         </w:tc>
@@ -1911,7 +3386,7 @@
                 <w:sz w:val="22"/>
                 <w:szCs w:val="22"/>
               </w:rPr>
-              <w:t xml:space="preserve">→ plan / ask / edit</w:t>
+              <w:t xml:space="preserve">→ vul in</w:t>
             </w:r>
           </w:p>
         </w:tc>
@@ -1942,7 +3417,7 @@
                 <w:sz w:val="22"/>
                 <w:szCs w:val="22"/>
               </w:rPr>
-              <w:t xml:space="preserve">Prompts gesteld</w:t>
+              <w:t xml:space="preserve">Bijsturingen</w:t>
             </w:r>
           </w:p>
         </w:tc>
@@ -2002,7 +3477,7 @@
                 <w:sz w:val="22"/>
                 <w:szCs w:val="22"/>
               </w:rPr>
-              <w:t xml:space="preserve">Bijsturingen</w:t>
+              <w:t xml:space="preserve">Resultaat</w:t>
             </w:r>
           </w:p>
         </w:tc>
@@ -2036,66 +3511,6 @@
           </w:p>
         </w:tc>
       </w:tr>
-      <w:tr>
-        <w:tc>
-          <w:tcPr>
-            <w:tcW w:type="dxa" w:w="2500"/>
-            <w:tcBorders>
-              <w:top w:val="single" w:color="CCCCCC" w:sz="1"/>
-              <w:left w:val="single" w:color="CCCCCC" w:sz="1"/>
-              <w:bottom w:val="single" w:color="CCCCCC" w:sz="1"/>
-              <w:right w:val="single" w:color="CCCCCC" w:sz="1"/>
-            </w:tcBorders>
-            <w:shd w:fill="EEF3FA" w:val="clear"/>
-            <w:tcMar>
-              <w:top w:type="dxa" w:w="80"/>
-              <w:left w:type="dxa" w:w="120"/>
-              <w:bottom w:type="dxa" w:w="80"/>
-              <w:right w:type="dxa" w:w="120"/>
-            </w:tcMar>
-          </w:tcPr>
-          <w:p>
-            <w:r>
-              <w:rPr>
-                <w:b/>
-                <w:bCs/>
-                <w:sz w:val="22"/>
-                <w:szCs w:val="22"/>
-              </w:rPr>
-              <w:t xml:space="preserve">Resultaat</w:t>
-            </w:r>
-          </w:p>
-        </w:tc>
-        <w:tc>
-          <w:tcPr>
-            <w:tcW w:type="dxa" w:w="6526"/>
-            <w:tcBorders>
-              <w:top w:val="single" w:color="CCCCCC" w:sz="1"/>
-              <w:left w:val="single" w:color="CCCCCC" w:sz="1"/>
-              <w:bottom w:val="single" w:color="CCCCCC" w:sz="1"/>
-              <w:right w:val="single" w:color="CCCCCC" w:sz="1"/>
-            </w:tcBorders>
-            <w:tcMar>
-              <w:top w:type="dxa" w:w="80"/>
-              <w:left w:type="dxa" w:w="120"/>
-              <w:bottom w:type="dxa" w:w="80"/>
-              <w:right w:type="dxa" w:w="120"/>
-            </w:tcMar>
-          </w:tcPr>
-          <w:p>
-            <w:r>
-              <w:rPr>
-                <w:i/>
-                <w:iCs/>
-                <w:color w:val="888888"/>
-                <w:sz w:val="22"/>
-                <w:szCs w:val="22"/>
-              </w:rPr>
-              <w:t xml:space="preserve">→ vul in</w:t>
-            </w:r>
-          </w:p>
-        </w:tc>
-      </w:tr>
     </w:tbl>
     <w:p>
       <w:pPr>
@@ -2110,7 +3525,7 @@
         <w:pStyle w:val="Heading2"/>
       </w:pPr>
       <w:r>
-        <w:t xml:space="preserve">Agent 4 — Dashboard &amp; localStorage</w:t>
+        <w:t xml:space="preserve">Agent 4 — Audio playback &amp; UI feedback</w:t>
       </w:r>
     </w:p>
     <w:tbl>
@@ -2298,13 +3713,73 @@
           <w:p>
             <w:r>
               <w:rPr>
+                <w:i w:val="false"/>
+                <w:iCs w:val="false"/>
+                <w:color w:val="000000"/>
+                <w:sz w:val="22"/>
+                <w:szCs w:val="22"/>
+              </w:rPr>
+              <w:t xml:space="preserve">Claude Code</w:t>
+            </w:r>
+          </w:p>
+        </w:tc>
+      </w:tr>
+      <w:tr>
+        <w:tc>
+          <w:tcPr>
+            <w:tcW w:type="dxa" w:w="2500"/>
+            <w:tcBorders>
+              <w:top w:val="single" w:color="CCCCCC" w:sz="1"/>
+              <w:left w:val="single" w:color="CCCCCC" w:sz="1"/>
+              <w:bottom w:val="single" w:color="CCCCCC" w:sz="1"/>
+              <w:right w:val="single" w:color="CCCCCC" w:sz="1"/>
+            </w:tcBorders>
+            <w:shd w:fill="EEF3FA" w:val="clear"/>
+            <w:tcMar>
+              <w:top w:type="dxa" w:w="80"/>
+              <w:left w:type="dxa" w:w="120"/>
+              <w:bottom w:type="dxa" w:w="80"/>
+              <w:right w:type="dxa" w:w="120"/>
+            </w:tcMar>
+          </w:tcPr>
+          <w:p>
+            <w:r>
+              <w:rPr>
+                <w:b/>
+                <w:bCs/>
+                <w:sz w:val="22"/>
+                <w:szCs w:val="22"/>
+              </w:rPr>
+              <w:t xml:space="preserve">Modus</w:t>
+            </w:r>
+          </w:p>
+        </w:tc>
+        <w:tc>
+          <w:tcPr>
+            <w:tcW w:type="dxa" w:w="6526"/>
+            <w:tcBorders>
+              <w:top w:val="single" w:color="CCCCCC" w:sz="1"/>
+              <w:left w:val="single" w:color="CCCCCC" w:sz="1"/>
+              <w:bottom w:val="single" w:color="CCCCCC" w:sz="1"/>
+              <w:right w:val="single" w:color="CCCCCC" w:sz="1"/>
+            </w:tcBorders>
+            <w:tcMar>
+              <w:top w:type="dxa" w:w="80"/>
+              <w:left w:type="dxa" w:w="120"/>
+              <w:bottom w:type="dxa" w:w="80"/>
+              <w:right w:type="dxa" w:w="120"/>
+            </w:tcMar>
+          </w:tcPr>
+          <w:p>
+            <w:r>
+              <w:rPr>
                 <w:i/>
                 <w:iCs/>
                 <w:color w:val="888888"/>
                 <w:sz w:val="22"/>
                 <w:szCs w:val="22"/>
               </w:rPr>
-              <w:t xml:space="preserve">→ vul in (bv. Claude Code, Cursor)</w:t>
+              <w:t xml:space="preserve">→ edit</w:t>
             </w:r>
           </w:p>
         </w:tc>
@@ -2335,7 +3810,7 @@
                 <w:sz w:val="22"/>
                 <w:szCs w:val="22"/>
               </w:rPr>
-              <w:t xml:space="preserve">Modus</w:t>
+              <w:t xml:space="preserve">Prompts gesteld</w:t>
             </w:r>
           </w:p>
         </w:tc>
@@ -2364,7 +3839,7 @@
                 <w:sz w:val="22"/>
                 <w:szCs w:val="22"/>
               </w:rPr>
-              <w:t xml:space="preserve">→ plan / ask / edit</w:t>
+              <w:t xml:space="preserve">→ vul in</w:t>
             </w:r>
           </w:p>
         </w:tc>
@@ -2395,7 +3870,7 @@
                 <w:sz w:val="22"/>
                 <w:szCs w:val="22"/>
               </w:rPr>
-              <w:t xml:space="preserve">Prompts gesteld</w:t>
+              <w:t xml:space="preserve">Bijsturingen</w:t>
             </w:r>
           </w:p>
         </w:tc>
@@ -2455,7 +3930,7 @@
                 <w:sz w:val="22"/>
                 <w:szCs w:val="22"/>
               </w:rPr>
-              <w:t xml:space="preserve">Bijsturingen</w:t>
+              <w:t xml:space="preserve">Resultaat</w:t>
             </w:r>
           </w:p>
         </w:tc>
@@ -2489,66 +3964,6 @@
           </w:p>
         </w:tc>
       </w:tr>
-      <w:tr>
-        <w:tc>
-          <w:tcPr>
-            <w:tcW w:type="dxa" w:w="2500"/>
-            <w:tcBorders>
-              <w:top w:val="single" w:color="CCCCCC" w:sz="1"/>
-              <w:left w:val="single" w:color="CCCCCC" w:sz="1"/>
-              <w:bottom w:val="single" w:color="CCCCCC" w:sz="1"/>
-              <w:right w:val="single" w:color="CCCCCC" w:sz="1"/>
-            </w:tcBorders>
-            <w:shd w:fill="EEF3FA" w:val="clear"/>
-            <w:tcMar>
-              <w:top w:type="dxa" w:w="80"/>
-              <w:left w:type="dxa" w:w="120"/>
-              <w:bottom w:type="dxa" w:w="80"/>
-              <w:right w:type="dxa" w:w="120"/>
-            </w:tcMar>
-          </w:tcPr>
-          <w:p>
-            <w:r>
-              <w:rPr>
-                <w:b/>
-                <w:bCs/>
-                <w:sz w:val="22"/>
-                <w:szCs w:val="22"/>
-              </w:rPr>
-              <w:t xml:space="preserve">Resultaat</w:t>
-            </w:r>
-          </w:p>
-        </w:tc>
-        <w:tc>
-          <w:tcPr>
-            <w:tcW w:type="dxa" w:w="6526"/>
-            <w:tcBorders>
-              <w:top w:val="single" w:color="CCCCCC" w:sz="1"/>
-              <w:left w:val="single" w:color="CCCCCC" w:sz="1"/>
-              <w:bottom w:val="single" w:color="CCCCCC" w:sz="1"/>
-              <w:right w:val="single" w:color="CCCCCC" w:sz="1"/>
-            </w:tcBorders>
-            <w:tcMar>
-              <w:top w:type="dxa" w:w="80"/>
-              <w:left w:type="dxa" w:w="120"/>
-              <w:bottom w:type="dxa" w:w="80"/>
-              <w:right w:type="dxa" w:w="120"/>
-            </w:tcMar>
-          </w:tcPr>
-          <w:p>
-            <w:r>
-              <w:rPr>
-                <w:i/>
-                <w:iCs/>
-                <w:color w:val="888888"/>
-                <w:sz w:val="22"/>
-                <w:szCs w:val="22"/>
-              </w:rPr>
-              <w:t xml:space="preserve">→ vul in</w:t>
-            </w:r>
-          </w:p>
-        </w:tc>
-      </w:tr>
     </w:tbl>
     <w:p>
       <w:pPr>
@@ -2563,7 +3978,7 @@
         <w:pStyle w:val="Heading2"/>
       </w:pPr>
       <w:r>
-        <w:t xml:space="preserve">Agent 5 — Eigen uitbreiding</w:t>
+        <w:t xml:space="preserve">Agent 5 — Dashboard &amp; localStorage</w:t>
       </w:r>
     </w:p>
     <w:tbl>
@@ -2751,526 +4166,73 @@
           <w:p>
             <w:r>
               <w:rPr>
+                <w:i w:val="false"/>
+                <w:iCs w:val="false"/>
+                <w:color w:val="000000"/>
+                <w:sz w:val="22"/>
+                <w:szCs w:val="22"/>
+              </w:rPr>
+              <w:t xml:space="preserve">Claude Code</w:t>
+            </w:r>
+          </w:p>
+        </w:tc>
+      </w:tr>
+      <w:tr>
+        <w:tc>
+          <w:tcPr>
+            <w:tcW w:type="dxa" w:w="2500"/>
+            <w:tcBorders>
+              <w:top w:val="single" w:color="CCCCCC" w:sz="1"/>
+              <w:left w:val="single" w:color="CCCCCC" w:sz="1"/>
+              <w:bottom w:val="single" w:color="CCCCCC" w:sz="1"/>
+              <w:right w:val="single" w:color="CCCCCC" w:sz="1"/>
+            </w:tcBorders>
+            <w:shd w:fill="EEF3FA" w:val="clear"/>
+            <w:tcMar>
+              <w:top w:type="dxa" w:w="80"/>
+              <w:left w:type="dxa" w:w="120"/>
+              <w:bottom w:type="dxa" w:w="80"/>
+              <w:right w:type="dxa" w:w="120"/>
+            </w:tcMar>
+          </w:tcPr>
+          <w:p>
+            <w:r>
+              <w:rPr>
+                <w:b/>
+                <w:bCs/>
+                <w:sz w:val="22"/>
+                <w:szCs w:val="22"/>
+              </w:rPr>
+              <w:t xml:space="preserve">Modus</w:t>
+            </w:r>
+          </w:p>
+        </w:tc>
+        <w:tc>
+          <w:tcPr>
+            <w:tcW w:type="dxa" w:w="6526"/>
+            <w:tcBorders>
+              <w:top w:val="single" w:color="CCCCCC" w:sz="1"/>
+              <w:left w:val="single" w:color="CCCCCC" w:sz="1"/>
+              <w:bottom w:val="single" w:color="CCCCCC" w:sz="1"/>
+              <w:right w:val="single" w:color="CCCCCC" w:sz="1"/>
+            </w:tcBorders>
+            <w:tcMar>
+              <w:top w:type="dxa" w:w="80"/>
+              <w:left w:type="dxa" w:w="120"/>
+              <w:bottom w:type="dxa" w:w="80"/>
+              <w:right w:type="dxa" w:w="120"/>
+            </w:tcMar>
+          </w:tcPr>
+          <w:p>
+            <w:r>
+              <w:rPr>
                 <w:i/>
                 <w:iCs/>
                 <w:color w:val="888888"/>
                 <w:sz w:val="22"/>
                 <w:szCs w:val="22"/>
               </w:rPr>
-              <w:t xml:space="preserve">→ vul in (bv. Claude Code, Cursor)</w:t>
-            </w:r>
-          </w:p>
-        </w:tc>
-      </w:tr>
-      <w:tr>
-        <w:tc>
-          <w:tcPr>
-            <w:tcW w:type="dxa" w:w="2500"/>
-            <w:tcBorders>
-              <w:top w:val="single" w:color="CCCCCC" w:sz="1"/>
-              <w:left w:val="single" w:color="CCCCCC" w:sz="1"/>
-              <w:bottom w:val="single" w:color="CCCCCC" w:sz="1"/>
-              <w:right w:val="single" w:color="CCCCCC" w:sz="1"/>
-            </w:tcBorders>
-            <w:shd w:fill="EEF3FA" w:val="clear"/>
-            <w:tcMar>
-              <w:top w:type="dxa" w:w="80"/>
-              <w:left w:type="dxa" w:w="120"/>
-              <w:bottom w:type="dxa" w:w="80"/>
-              <w:right w:type="dxa" w:w="120"/>
-            </w:tcMar>
-          </w:tcPr>
-          <w:p>
-            <w:r>
-              <w:rPr>
-                <w:b/>
-                <w:bCs/>
-                <w:sz w:val="22"/>
-                <w:szCs w:val="22"/>
-              </w:rPr>
-              <w:t xml:space="preserve">Modus</w:t>
-            </w:r>
-          </w:p>
-        </w:tc>
-        <w:tc>
-          <w:tcPr>
-            <w:tcW w:type="dxa" w:w="6526"/>
-            <w:tcBorders>
-              <w:top w:val="single" w:color="CCCCCC" w:sz="1"/>
-              <w:left w:val="single" w:color="CCCCCC" w:sz="1"/>
-              <w:bottom w:val="single" w:color="CCCCCC" w:sz="1"/>
-              <w:right w:val="single" w:color="CCCCCC" w:sz="1"/>
-            </w:tcBorders>
-            <w:tcMar>
-              <w:top w:type="dxa" w:w="80"/>
-              <w:left w:type="dxa" w:w="120"/>
-              <w:bottom w:type="dxa" w:w="80"/>
-              <w:right w:type="dxa" w:w="120"/>
-            </w:tcMar>
-          </w:tcPr>
-          <w:p>
-            <w:r>
-              <w:rPr>
-                <w:i/>
-                <w:iCs/>
-                <w:color w:val="888888"/>
-                <w:sz w:val="22"/>
-                <w:szCs w:val="22"/>
-              </w:rPr>
-              <w:t xml:space="preserve">→ plan / ask / edit</w:t>
-            </w:r>
-          </w:p>
-        </w:tc>
-      </w:tr>
-      <w:tr>
-        <w:tc>
-          <w:tcPr>
-            <w:tcW w:type="dxa" w:w="2500"/>
-            <w:tcBorders>
-              <w:top w:val="single" w:color="CCCCCC" w:sz="1"/>
-              <w:left w:val="single" w:color="CCCCCC" w:sz="1"/>
-              <w:bottom w:val="single" w:color="CCCCCC" w:sz="1"/>
-              <w:right w:val="single" w:color="CCCCCC" w:sz="1"/>
-            </w:tcBorders>
-            <w:shd w:fill="EEF3FA" w:val="clear"/>
-            <w:tcMar>
-              <w:top w:type="dxa" w:w="80"/>
-              <w:left w:type="dxa" w:w="120"/>
-              <w:bottom w:type="dxa" w:w="80"/>
-              <w:right w:type="dxa" w:w="120"/>
-            </w:tcMar>
-          </w:tcPr>
-          <w:p>
-            <w:r>
-              <w:rPr>
-                <w:b/>
-                <w:bCs/>
-                <w:sz w:val="22"/>
-                <w:szCs w:val="22"/>
-              </w:rPr>
-              <w:t xml:space="preserve">Prompts gesteld</w:t>
-            </w:r>
-          </w:p>
-        </w:tc>
-        <w:tc>
-          <w:tcPr>
-            <w:tcW w:type="dxa" w:w="6526"/>
-            <w:tcBorders>
-              <w:top w:val="single" w:color="CCCCCC" w:sz="1"/>
-              <w:left w:val="single" w:color="CCCCCC" w:sz="1"/>
-              <w:bottom w:val="single" w:color="CCCCCC" w:sz="1"/>
-              <w:right w:val="single" w:color="CCCCCC" w:sz="1"/>
-            </w:tcBorders>
-            <w:tcMar>
-              <w:top w:type="dxa" w:w="80"/>
-              <w:left w:type="dxa" w:w="120"/>
-              <w:bottom w:type="dxa" w:w="80"/>
-              <w:right w:type="dxa" w:w="120"/>
-            </w:tcMar>
-          </w:tcPr>
-          <w:p>
-            <w:r>
-              <w:rPr>
-                <w:i/>
-                <w:iCs/>
-                <w:color w:val="888888"/>
-                <w:sz w:val="22"/>
-                <w:szCs w:val="22"/>
-              </w:rPr>
-              <w:t xml:space="preserve">→ vul in</w:t>
-            </w:r>
-          </w:p>
-        </w:tc>
-      </w:tr>
-      <w:tr>
-        <w:tc>
-          <w:tcPr>
-            <w:tcW w:type="dxa" w:w="2500"/>
-            <w:tcBorders>
-              <w:top w:val="single" w:color="CCCCCC" w:sz="1"/>
-              <w:left w:val="single" w:color="CCCCCC" w:sz="1"/>
-              <w:bottom w:val="single" w:color="CCCCCC" w:sz="1"/>
-              <w:right w:val="single" w:color="CCCCCC" w:sz="1"/>
-            </w:tcBorders>
-            <w:shd w:fill="EEF3FA" w:val="clear"/>
-            <w:tcMar>
-              <w:top w:type="dxa" w:w="80"/>
-              <w:left w:type="dxa" w:w="120"/>
-              <w:bottom w:type="dxa" w:w="80"/>
-              <w:right w:type="dxa" w:w="120"/>
-            </w:tcMar>
-          </w:tcPr>
-          <w:p>
-            <w:r>
-              <w:rPr>
-                <w:b/>
-                <w:bCs/>
-                <w:sz w:val="22"/>
-                <w:szCs w:val="22"/>
-              </w:rPr>
-              <w:t xml:space="preserve">Bijsturingen</w:t>
-            </w:r>
-          </w:p>
-        </w:tc>
-        <w:tc>
-          <w:tcPr>
-            <w:tcW w:type="dxa" w:w="6526"/>
-            <w:tcBorders>
-              <w:top w:val="single" w:color="CCCCCC" w:sz="1"/>
-              <w:left w:val="single" w:color="CCCCCC" w:sz="1"/>
-              <w:bottom w:val="single" w:color="CCCCCC" w:sz="1"/>
-              <w:right w:val="single" w:color="CCCCCC" w:sz="1"/>
-            </w:tcBorders>
-            <w:tcMar>
-              <w:top w:type="dxa" w:w="80"/>
-              <w:left w:type="dxa" w:w="120"/>
-              <w:bottom w:type="dxa" w:w="80"/>
-              <w:right w:type="dxa" w:w="120"/>
-            </w:tcMar>
-          </w:tcPr>
-          <w:p>
-            <w:r>
-              <w:rPr>
-                <w:i/>
-                <w:iCs/>
-                <w:color w:val="888888"/>
-                <w:sz w:val="22"/>
-                <w:szCs w:val="22"/>
-              </w:rPr>
-              <w:t xml:space="preserve">→ vul in</w:t>
-            </w:r>
-          </w:p>
-        </w:tc>
-      </w:tr>
-      <w:tr>
-        <w:tc>
-          <w:tcPr>
-            <w:tcW w:type="dxa" w:w="2500"/>
-            <w:tcBorders>
-              <w:top w:val="single" w:color="CCCCCC" w:sz="1"/>
-              <w:left w:val="single" w:color="CCCCCC" w:sz="1"/>
-              <w:bottom w:val="single" w:color="CCCCCC" w:sz="1"/>
-              <w:right w:val="single" w:color="CCCCCC" w:sz="1"/>
-            </w:tcBorders>
-            <w:shd w:fill="EEF3FA" w:val="clear"/>
-            <w:tcMar>
-              <w:top w:type="dxa" w:w="80"/>
-              <w:left w:type="dxa" w:w="120"/>
-              <w:bottom w:type="dxa" w:w="80"/>
-              <w:right w:type="dxa" w:w="120"/>
-            </w:tcMar>
-          </w:tcPr>
-          <w:p>
-            <w:r>
-              <w:rPr>
-                <w:b/>
-                <w:bCs/>
-                <w:sz w:val="22"/>
-                <w:szCs w:val="22"/>
-              </w:rPr>
-              <w:t xml:space="preserve">Resultaat</w:t>
-            </w:r>
-          </w:p>
-        </w:tc>
-        <w:tc>
-          <w:tcPr>
-            <w:tcW w:type="dxa" w:w="6526"/>
-            <w:tcBorders>
-              <w:top w:val="single" w:color="CCCCCC" w:sz="1"/>
-              <w:left w:val="single" w:color="CCCCCC" w:sz="1"/>
-              <w:bottom w:val="single" w:color="CCCCCC" w:sz="1"/>
-              <w:right w:val="single" w:color="CCCCCC" w:sz="1"/>
-            </w:tcBorders>
-            <w:tcMar>
-              <w:top w:type="dxa" w:w="80"/>
-              <w:left w:type="dxa" w:w="120"/>
-              <w:bottom w:type="dxa" w:w="80"/>
-              <w:right w:type="dxa" w:w="120"/>
-            </w:tcMar>
-          </w:tcPr>
-          <w:p>
-            <w:r>
-              <w:rPr>
-                <w:i/>
-                <w:iCs/>
-                <w:color w:val="888888"/>
-                <w:sz w:val="22"/>
-                <w:szCs w:val="22"/>
-              </w:rPr>
-              <w:t xml:space="preserve">→ vul in</w:t>
-            </w:r>
-          </w:p>
-        </w:tc>
-      </w:tr>
-    </w:tbl>
-    <w:p>
-      <w:pPr>
-        <w:spacing w:after="120"/>
-      </w:pPr>
-      <w:r>
-        <w:t xml:space="preserve"/>
-      </w:r>
-    </w:p>
-    <w:p>
-      <w:pPr>
-        <w:pStyle w:val="Heading2"/>
-      </w:pPr>
-      <w:r>
-        <w:t xml:space="preserve">Agent 6 — Stijl, design &amp; responsiveness</w:t>
-      </w:r>
-    </w:p>
-    <w:tbl>
-      <w:tblPr>
-        <w:tblW w:type="dxa" w:w="9026"/>
-        <w:tblBorders>
-          <w:top w:val="single" w:color="auto" w:sz="4"/>
-          <w:left w:val="single" w:color="auto" w:sz="4"/>
-          <w:bottom w:val="single" w:color="auto" w:sz="4"/>
-          <w:right w:val="single" w:color="auto" w:sz="4"/>
-          <w:insideH w:val="single" w:color="auto" w:sz="4"/>
-          <w:insideV w:val="single" w:color="auto" w:sz="4"/>
-        </w:tblBorders>
-      </w:tblPr>
-      <w:tblGrid>
-        <w:gridCol w:w="2500"/>
-        <w:gridCol w:w="6526"/>
-      </w:tblGrid>
-      <w:tr>
-        <w:tc>
-          <w:tcPr>
-            <w:tcW w:type="dxa" w:w="2500"/>
-            <w:tcBorders>
-              <w:top w:val="single" w:color="CCCCCC" w:sz="1"/>
-              <w:left w:val="single" w:color="CCCCCC" w:sz="1"/>
-              <w:bottom w:val="single" w:color="CCCCCC" w:sz="1"/>
-              <w:right w:val="single" w:color="CCCCCC" w:sz="1"/>
-            </w:tcBorders>
-            <w:shd w:fill="EEF3FA" w:val="clear"/>
-            <w:tcMar>
-              <w:top w:type="dxa" w:w="80"/>
-              <w:left w:type="dxa" w:w="120"/>
-              <w:bottom w:type="dxa" w:w="80"/>
-              <w:right w:type="dxa" w:w="120"/>
-            </w:tcMar>
-          </w:tcPr>
-          <w:p>
-            <w:r>
-              <w:rPr>
-                <w:b/>
-                <w:bCs/>
-                <w:sz w:val="22"/>
-                <w:szCs w:val="22"/>
-              </w:rPr>
-              <w:t xml:space="preserve">Agent #</w:t>
-            </w:r>
-          </w:p>
-        </w:tc>
-        <w:tc>
-          <w:tcPr>
-            <w:tcW w:type="dxa" w:w="6526"/>
-            <w:tcBorders>
-              <w:top w:val="single" w:color="CCCCCC" w:sz="1"/>
-              <w:left w:val="single" w:color="CCCCCC" w:sz="1"/>
-              <w:bottom w:val="single" w:color="CCCCCC" w:sz="1"/>
-              <w:right w:val="single" w:color="CCCCCC" w:sz="1"/>
-            </w:tcBorders>
-            <w:tcMar>
-              <w:top w:type="dxa" w:w="80"/>
-              <w:left w:type="dxa" w:w="120"/>
-              <w:bottom w:type="dxa" w:w="80"/>
-              <w:right w:type="dxa" w:w="120"/>
-            </w:tcMar>
-          </w:tcPr>
-          <w:p>
-            <w:r>
-              <w:rPr>
-                <w:i w:val="false"/>
-                <w:iCs w:val="false"/>
-                <w:color w:val="000000"/>
-                <w:sz w:val="22"/>
-                <w:szCs w:val="22"/>
-              </w:rPr>
-              <w:t xml:space="preserve">Agent 6</w:t>
-            </w:r>
-          </w:p>
-        </w:tc>
-      </w:tr>
-      <w:tr>
-        <w:tc>
-          <w:tcPr>
-            <w:tcW w:type="dxa" w:w="2500"/>
-            <w:tcBorders>
-              <w:top w:val="single" w:color="CCCCCC" w:sz="1"/>
-              <w:left w:val="single" w:color="CCCCCC" w:sz="1"/>
-              <w:bottom w:val="single" w:color="CCCCCC" w:sz="1"/>
-              <w:right w:val="single" w:color="CCCCCC" w:sz="1"/>
-            </w:tcBorders>
-            <w:shd w:fill="EEF3FA" w:val="clear"/>
-            <w:tcMar>
-              <w:top w:type="dxa" w:w="80"/>
-              <w:left w:type="dxa" w:w="120"/>
-              <w:bottom w:type="dxa" w:w="80"/>
-              <w:right w:type="dxa" w:w="120"/>
-            </w:tcMar>
-          </w:tcPr>
-          <w:p>
-            <w:r>
-              <w:rPr>
-                <w:b/>
-                <w:bCs/>
-                <w:sz w:val="22"/>
-                <w:szCs w:val="22"/>
-              </w:rPr>
-              <w:t xml:space="preserve">Deeltaak</w:t>
-            </w:r>
-          </w:p>
-        </w:tc>
-        <w:tc>
-          <w:tcPr>
-            <w:tcW w:type="dxa" w:w="6526"/>
-            <w:tcBorders>
-              <w:top w:val="single" w:color="CCCCCC" w:sz="1"/>
-              <w:left w:val="single" w:color="CCCCCC" w:sz="1"/>
-              <w:bottom w:val="single" w:color="CCCCCC" w:sz="1"/>
-              <w:right w:val="single" w:color="CCCCCC" w:sz="1"/>
-            </w:tcBorders>
-            <w:tcMar>
-              <w:top w:type="dxa" w:w="80"/>
-              <w:left w:type="dxa" w:w="120"/>
-              <w:bottom w:type="dxa" w:w="80"/>
-              <w:right w:type="dxa" w:w="120"/>
-            </w:tcMar>
-          </w:tcPr>
-          <w:p>
-            <w:r>
-              <w:rPr>
-                <w:i/>
-                <w:iCs/>
-                <w:color w:val="888888"/>
-                <w:sz w:val="22"/>
-                <w:szCs w:val="22"/>
-              </w:rPr>
-              <w:t xml:space="preserve">→ vul in</w:t>
-            </w:r>
-          </w:p>
-        </w:tc>
-      </w:tr>
-      <w:tr>
-        <w:tc>
-          <w:tcPr>
-            <w:tcW w:type="dxa" w:w="2500"/>
-            <w:tcBorders>
-              <w:top w:val="single" w:color="CCCCCC" w:sz="1"/>
-              <w:left w:val="single" w:color="CCCCCC" w:sz="1"/>
-              <w:bottom w:val="single" w:color="CCCCCC" w:sz="1"/>
-              <w:right w:val="single" w:color="CCCCCC" w:sz="1"/>
-            </w:tcBorders>
-            <w:shd w:fill="EEF3FA" w:val="clear"/>
-            <w:tcMar>
-              <w:top w:type="dxa" w:w="80"/>
-              <w:left w:type="dxa" w:w="120"/>
-              <w:bottom w:type="dxa" w:w="80"/>
-              <w:right w:type="dxa" w:w="120"/>
-            </w:tcMar>
-          </w:tcPr>
-          <w:p>
-            <w:r>
-              <w:rPr>
-                <w:b/>
-                <w:bCs/>
-                <w:sz w:val="22"/>
-                <w:szCs w:val="22"/>
-              </w:rPr>
-              <w:t xml:space="preserve">Tool / model</w:t>
-            </w:r>
-          </w:p>
-        </w:tc>
-        <w:tc>
-          <w:tcPr>
-            <w:tcW w:type="dxa" w:w="6526"/>
-            <w:tcBorders>
-              <w:top w:val="single" w:color="CCCCCC" w:sz="1"/>
-              <w:left w:val="single" w:color="CCCCCC" w:sz="1"/>
-              <w:bottom w:val="single" w:color="CCCCCC" w:sz="1"/>
-              <w:right w:val="single" w:color="CCCCCC" w:sz="1"/>
-            </w:tcBorders>
-            <w:tcMar>
-              <w:top w:type="dxa" w:w="80"/>
-              <w:left w:type="dxa" w:w="120"/>
-              <w:bottom w:type="dxa" w:w="80"/>
-              <w:right w:type="dxa" w:w="120"/>
-            </w:tcMar>
-          </w:tcPr>
-          <w:p>
-            <w:r>
-              <w:rPr>
-                <w:i/>
-                <w:iCs/>
-                <w:color w:val="888888"/>
-                <w:sz w:val="22"/>
-                <w:szCs w:val="22"/>
-              </w:rPr>
-              <w:t xml:space="preserve">→ vul in (bv. Claude Code, Cursor)</w:t>
-            </w:r>
-          </w:p>
-        </w:tc>
-      </w:tr>
-      <w:tr>
-        <w:tc>
-          <w:tcPr>
-            <w:tcW w:type="dxa" w:w="2500"/>
-            <w:tcBorders>
-              <w:top w:val="single" w:color="CCCCCC" w:sz="1"/>
-              <w:left w:val="single" w:color="CCCCCC" w:sz="1"/>
-              <w:bottom w:val="single" w:color="CCCCCC" w:sz="1"/>
-              <w:right w:val="single" w:color="CCCCCC" w:sz="1"/>
-            </w:tcBorders>
-            <w:shd w:fill="EEF3FA" w:val="clear"/>
-            <w:tcMar>
-              <w:top w:type="dxa" w:w="80"/>
-              <w:left w:type="dxa" w:w="120"/>
-              <w:bottom w:type="dxa" w:w="80"/>
-              <w:right w:type="dxa" w:w="120"/>
-            </w:tcMar>
-          </w:tcPr>
-          <w:p>
-            <w:r>
-              <w:rPr>
-                <w:b/>
-                <w:bCs/>
-                <w:sz w:val="22"/>
-                <w:szCs w:val="22"/>
-              </w:rPr>
-              <w:t xml:space="preserve">Modus</w:t>
-            </w:r>
-          </w:p>
-        </w:tc>
-        <w:tc>
-          <w:tcPr>
-            <w:tcW w:type="dxa" w:w="6526"/>
-            <w:tcBorders>
-              <w:top w:val="single" w:color="CCCCCC" w:sz="1"/>
-              <w:left w:val="single" w:color="CCCCCC" w:sz="1"/>
-              <w:bottom w:val="single" w:color="CCCCCC" w:sz="1"/>
-              <w:right w:val="single" w:color="CCCCCC" w:sz="1"/>
-            </w:tcBorders>
-            <w:tcMar>
-              <w:top w:type="dxa" w:w="80"/>
-              <w:left w:type="dxa" w:w="120"/>
-              <w:bottom w:type="dxa" w:w="80"/>
-              <w:right w:type="dxa" w:w="120"/>
-            </w:tcMar>
-          </w:tcPr>
-          <w:p>
-            <w:r>
-              <w:rPr>
-                <w:i/>
-                <w:iCs/>
-                <w:color w:val="888888"/>
-                <w:sz w:val="22"/>
-                <w:szCs w:val="22"/>
-              </w:rPr>
-              <w:t xml:space="preserve">→ plan / ask / edit</w:t>
+              <w:t xml:space="preserve">→ edit</w:t>
             </w:r>
           </w:p>
         </w:tc>
@@ -3837,8 +4799,32 @@
       </w:pPr>
     </w:lvl>
   </w:abstractNum>
+  <w:abstractNum w:abstractNumId="3" w15:restartNumberingAfterBreak="0">
+    <w:multiLevelType w:val="hybridMultilevel"/>
+    <w:lvl w:ilvl="0" w15:tentative="1">
+      <w:start w:val="1"/>
+      <w:numFmt w:val="decimal"/>
+      <w:lvlText w:val="%1."/>
+      <w:lvlJc w:val="left"/>
+      <w:pPr>
+        <w:ind w:left="720" w:hanging="360"/>
+      </w:pPr>
+    </w:lvl>
+  </w:abstractNum>
   <w:num w:numId="1">
     <w:abstractNumId w:val="1"/>
+    <w:lvlOverride w:ilvl="0">
+      <w:startOverride w:val="1"/>
+    </w:lvlOverride>
+  </w:num>
+  <w:num w:numId="2">
+    <w:abstractNumId w:val="2"/>
+    <w:lvlOverride w:ilvl="0">
+      <w:startOverride w:val="1"/>
+    </w:lvlOverride>
+  </w:num>
+  <w:num w:numId="3">
+    <w:abstractNumId w:val="3"/>
     <w:lvlOverride w:ilvl="0">
       <w:startOverride w:val="1"/>
     </w:lvlOverride>

</xml_diff>

<commit_message>
feat: add audio playback, favourites & remove all
</commit_message>
<xml_diff>
--- a/documentatie.docx
+++ b/documentatie.docx
@@ -3200,73 +3200,13 @@
           <w:p>
             <w:r>
               <w:rPr>
-                <w:i/>
-                <w:iCs/>
-                <w:color w:val="888888"/>
-                <w:sz w:val="22"/>
-                <w:szCs w:val="22"/>
-              </w:rPr>
-              <w:t xml:space="preserve">→ vul in</w:t>
-            </w:r>
-          </w:p>
-        </w:tc>
-      </w:tr>
-      <w:tr>
-        <w:tc>
-          <w:tcPr>
-            <w:tcW w:type="dxa" w:w="2500"/>
-            <w:tcBorders>
-              <w:top w:val="single" w:color="CCCCCC" w:sz="1"/>
-              <w:left w:val="single" w:color="CCCCCC" w:sz="1"/>
-              <w:bottom w:val="single" w:color="CCCCCC" w:sz="1"/>
-              <w:right w:val="single" w:color="CCCCCC" w:sz="1"/>
-            </w:tcBorders>
-            <w:shd w:fill="EEF3FA" w:val="clear"/>
-            <w:tcMar>
-              <w:top w:type="dxa" w:w="80"/>
-              <w:left w:type="dxa" w:w="120"/>
-              <w:bottom w:type="dxa" w:w="80"/>
-              <w:right w:type="dxa" w:w="120"/>
-            </w:tcMar>
-          </w:tcPr>
-          <w:p>
-            <w:r>
-              <w:rPr>
-                <w:b/>
-                <w:bCs/>
-                <w:sz w:val="22"/>
-                <w:szCs w:val="22"/>
-              </w:rPr>
-              <w:t xml:space="preserve">Tool / model</w:t>
-            </w:r>
-          </w:p>
-        </w:tc>
-        <w:tc>
-          <w:tcPr>
-            <w:tcW w:type="dxa" w:w="6526"/>
-            <w:tcBorders>
-              <w:top w:val="single" w:color="CCCCCC" w:sz="1"/>
-              <w:left w:val="single" w:color="CCCCCC" w:sz="1"/>
-              <w:bottom w:val="single" w:color="CCCCCC" w:sz="1"/>
-              <w:right w:val="single" w:color="CCCCCC" w:sz="1"/>
-            </w:tcBorders>
-            <w:tcMar>
-              <w:top w:type="dxa" w:w="80"/>
-              <w:left w:type="dxa" w:w="120"/>
-              <w:bottom w:type="dxa" w:w="80"/>
-              <w:right w:type="dxa" w:w="120"/>
-            </w:tcMar>
-          </w:tcPr>
-          <w:p>
-            <w:r>
-              <w:rPr>
                 <w:i w:val="false"/>
                 <w:iCs w:val="false"/>
                 <w:color w:val="000000"/>
                 <w:sz w:val="22"/>
                 <w:szCs w:val="22"/>
               </w:rPr>
-              <w:t xml:space="preserve">Claude Code</w:t>
+              <w:t xml:space="preserve">Freesound API koppeling &amp; zoekfunctie — renderResults functie</w:t>
             </w:r>
           </w:p>
         </w:tc>
@@ -3297,7 +3237,7 @@
                 <w:sz w:val="22"/>
                 <w:szCs w:val="22"/>
               </w:rPr>
-              <w:t xml:space="preserve">Modus</w:t>
+              <w:t xml:space="preserve">Tool / model</w:t>
             </w:r>
           </w:p>
         </w:tc>
@@ -3320,13 +3260,13 @@
           <w:p>
             <w:r>
               <w:rPr>
-                <w:i/>
-                <w:iCs/>
-                <w:color w:val="888888"/>
-                <w:sz w:val="22"/>
-                <w:szCs w:val="22"/>
-              </w:rPr>
-              <w:t xml:space="preserve">→ edit</w:t>
+                <w:i w:val="false"/>
+                <w:iCs w:val="false"/>
+                <w:color w:val="000000"/>
+                <w:sz w:val="22"/>
+                <w:szCs w:val="22"/>
+              </w:rPr>
+              <w:t xml:space="preserve">Claude Code</w:t>
             </w:r>
           </w:p>
         </w:tc>
@@ -3357,7 +3297,7 @@
                 <w:sz w:val="22"/>
                 <w:szCs w:val="22"/>
               </w:rPr>
-              <w:t xml:space="preserve">Prompts gesteld</w:t>
+              <w:t xml:space="preserve">Modus</w:t>
             </w:r>
           </w:p>
         </w:tc>
@@ -3380,13 +3320,13 @@
           <w:p>
             <w:r>
               <w:rPr>
-                <w:i/>
-                <w:iCs/>
-                <w:color w:val="888888"/>
-                <w:sz w:val="22"/>
-                <w:szCs w:val="22"/>
-              </w:rPr>
-              <w:t xml:space="preserve">→ vul in</w:t>
+                <w:i w:val="false"/>
+                <w:iCs w:val="false"/>
+                <w:color w:val="000000"/>
+                <w:sz w:val="22"/>
+                <w:szCs w:val="22"/>
+              </w:rPr>
+              <w:t xml:space="preserve">edit</w:t>
             </w:r>
           </w:p>
         </w:tc>
@@ -3417,7 +3357,7 @@
                 <w:sz w:val="22"/>
                 <w:szCs w:val="22"/>
               </w:rPr>
-              <w:t xml:space="preserve">Bijsturingen</w:t>
+              <w:t xml:space="preserve">Prompts gesteld</w:t>
             </w:r>
           </w:p>
         </w:tc>
@@ -3438,15 +3378,15 @@
             </w:tcMar>
           </w:tcPr>
           <w:p>
-            <w:r>
-              <w:rPr>
-                <w:i/>
-                <w:iCs/>
-                <w:color w:val="888888"/>
-                <w:sz w:val="22"/>
-                <w:szCs w:val="22"/>
-              </w:rPr>
-              <w:t xml:space="preserve">→ vul in</w:t>
+            <w:pPr>
+              <w:spacing w:after="40"/>
+            </w:pPr>
+            <w:r>
+              <w:rPr>
+                <w:sz w:val="22"/>
+                <w:szCs w:val="22"/>
+              </w:rPr>
+              <w:t xml:space="preserve">Gevraagd om de renderResults functie te genereren: dynamisch zoekresultaten renderen in de linker panel lijst op basis van de API response.</w:t>
             </w:r>
           </w:p>
         </w:tc>
@@ -3477,6 +3417,185 @@
                 <w:sz w:val="22"/>
                 <w:szCs w:val="22"/>
               </w:rPr>
+              <w:t xml:space="preserve">Bijsturingen</w:t>
+            </w:r>
+          </w:p>
+        </w:tc>
+        <w:tc>
+          <w:tcPr>
+            <w:tcW w:type="dxa" w:w="6526"/>
+            <w:tcBorders>
+              <w:top w:val="single" w:color="CCCCCC" w:sz="1"/>
+              <w:left w:val="single" w:color="CCCCCC" w:sz="1"/>
+              <w:bottom w:val="single" w:color="CCCCCC" w:sz="1"/>
+              <w:right w:val="single" w:color="CCCCCC" w:sz="1"/>
+            </w:tcBorders>
+            <w:tcMar>
+              <w:top w:type="dxa" w:w="80"/>
+              <w:left w:type="dxa" w:w="120"/>
+              <w:bottom w:type="dxa" w:w="80"/>
+              <w:right w:type="dxa" w:w="120"/>
+            </w:tcMar>
+          </w:tcPr>
+          <w:p>
+            <w:pPr>
+              <w:spacing w:after="40"/>
+            </w:pPr>
+            <w:r>
+              <w:rPr>
+                <w:sz w:val="22"/>
+                <w:szCs w:val="22"/>
+              </w:rPr>
+              <w:t xml:space="preserve">Rest manueel geimplementeerd:</w:t>
+            </w:r>
+          </w:p>
+          <w:p>
+            <w:pPr>
+              <w:pStyle w:val="ListParagraph"/>
+              <w:numPr>
+                <w:ilvl w:val="0"/>
+                <w:numId w:val="2"/>
+              </w:numPr>
+              <w:spacing w:after="40"/>
+            </w:pPr>
+            <w:r>
+              <w:rPr>
+                <w:sz w:val="22"/>
+                <w:szCs w:val="22"/>
+              </w:rPr>
+              <w:t xml:space="preserve">API setup — STR_API_KEY en STR_BASE_URL als constanten bovenaan het bestand.</w:t>
+            </w:r>
+          </w:p>
+          <w:p>
+            <w:pPr>
+              <w:pStyle w:val="ListParagraph"/>
+              <w:numPr>
+                <w:ilvl w:val="0"/>
+                <w:numId w:val="2"/>
+              </w:numPr>
+              <w:spacing w:after="40"/>
+            </w:pPr>
+            <w:r>
+              <w:rPr>
+                <w:sz w:val="22"/>
+                <w:szCs w:val="22"/>
+              </w:rPr>
+              <w:t xml:space="preserve">fetch aanroep opgebouwd met URLSearchParams voor query en fields.</w:t>
+            </w:r>
+          </w:p>
+          <w:p>
+            <w:pPr>
+              <w:pStyle w:val="ListParagraph"/>
+              <w:numPr>
+                <w:ilvl w:val="0"/>
+                <w:numId w:val="2"/>
+              </w:numPr>
+              <w:spacing w:after="40"/>
+            </w:pPr>
+            <w:r>
+              <w:rPr>
+                <w:sz w:val="22"/>
+                <w:szCs w:val="22"/>
+              </w:rPr>
+              <w:t xml:space="preserve">Event handling voor zoekbalk en resultatenlijst manueel geschreven.</w:t>
+            </w:r>
+          </w:p>
+          <w:p>
+            <w:pPr>
+              <w:pStyle w:val="ListParagraph"/>
+              <w:numPr>
+                <w:ilvl w:val="0"/>
+                <w:numId w:val="2"/>
+              </w:numPr>
+              <w:spacing w:after="40"/>
+            </w:pPr>
+            <w:r>
+              <w:rPr>
+                <w:sz w:val="22"/>
+                <w:szCs w:val="22"/>
+              </w:rPr>
+              <w:t xml:space="preserve">Selectie van een resultaat en update van de now playing banner manueel geimplementeerd.</w:t>
+            </w:r>
+          </w:p>
+          <w:p>
+            <w:pPr>
+              <w:pStyle w:val="ListParagraph"/>
+              <w:numPr>
+                <w:ilvl w:val="0"/>
+                <w:numId w:val="2"/>
+              </w:numPr>
+              <w:spacing w:after="40"/>
+            </w:pPr>
+            <w:r>
+              <w:rPr>
+                <w:sz w:val="22"/>
+                <w:szCs w:val="22"/>
+              </w:rPr>
+              <w:t xml:space="preserve">Geen play-knop op de resultatenrijen — bewuste UX-keuze, afspelen enkel via de banner.</w:t>
+            </w:r>
+          </w:p>
+          <w:p>
+            <w:pPr>
+              <w:pStyle w:val="ListParagraph"/>
+              <w:numPr>
+                <w:ilvl w:val="0"/>
+                <w:numId w:val="2"/>
+              </w:numPr>
+              <w:spacing w:after="40"/>
+            </w:pPr>
+            <w:r>
+              <w:rPr>
+                <w:sz w:val="22"/>
+                <w:szCs w:val="22"/>
+              </w:rPr>
+              <w:t xml:space="preserve">Actieve staat toegevoegd aan geselecteerde rij in de linker panel.</w:t>
+            </w:r>
+          </w:p>
+          <w:p>
+            <w:pPr>
+              <w:pStyle w:val="ListParagraph"/>
+              <w:numPr>
+                <w:ilvl w:val="0"/>
+                <w:numId w:val="2"/>
+              </w:numPr>
+              <w:spacing w:after="40"/>
+            </w:pPr>
+            <w:r>
+              <w:rPr>
+                <w:sz w:val="22"/>
+                <w:szCs w:val="22"/>
+              </w:rPr>
+              <w:t xml:space="preserve">Waveform afbeelding van de API (images.waveform_m) weergegeven in de now playing banner.</w:t>
+            </w:r>
+          </w:p>
+        </w:tc>
+      </w:tr>
+      <w:tr>
+        <w:tc>
+          <w:tcPr>
+            <w:tcW w:type="dxa" w:w="2500"/>
+            <w:tcBorders>
+              <w:top w:val="single" w:color="CCCCCC" w:sz="1"/>
+              <w:left w:val="single" w:color="CCCCCC" w:sz="1"/>
+              <w:bottom w:val="single" w:color="CCCCCC" w:sz="1"/>
+              <w:right w:val="single" w:color="CCCCCC" w:sz="1"/>
+            </w:tcBorders>
+            <w:shd w:fill="EEF3FA" w:val="clear"/>
+            <w:tcMar>
+              <w:top w:type="dxa" w:w="80"/>
+              <w:left w:type="dxa" w:w="120"/>
+              <w:bottom w:type="dxa" w:w="80"/>
+              <w:right w:type="dxa" w:w="120"/>
+            </w:tcMar>
+          </w:tcPr>
+          <w:p>
+            <w:r>
+              <w:rPr>
+                <w:b/>
+                <w:bCs/>
+                <w:sz w:val="22"/>
+                <w:szCs w:val="22"/>
+              </w:rPr>
               <w:t xml:space="preserve">Resultaat</w:t>
             </w:r>
           </w:p>
@@ -3500,13 +3619,13 @@
           <w:p>
             <w:r>
               <w:rPr>
-                <w:i/>
-                <w:iCs/>
-                <w:color w:val="888888"/>
-                <w:sz w:val="22"/>
-                <w:szCs w:val="22"/>
-              </w:rPr>
-              <w:t xml:space="preserve">→ vul in</w:t>
+                <w:i w:val="false"/>
+                <w:iCs w:val="false"/>
+                <w:color w:val="000000"/>
+                <w:sz w:val="22"/>
+                <w:szCs w:val="22"/>
+              </w:rPr>
+              <w:t xml:space="preserve">Zoekfunctie werkt — resultaten laden via Freesound API en worden weergegeven in de UI. Geselecteerd geluid verschijnt in de now playing banner. Commit: feat: freesound API &amp; zoekfunctie</w:t>
             </w:r>
           </w:p>
         </w:tc>
@@ -3525,7 +3644,7 @@
         <w:pStyle w:val="Heading2"/>
       </w:pPr>
       <w:r>
-        <w:t xml:space="preserve">Agent 4 — Audio playback &amp; UI feedback</w:t>
+        <w:t xml:space="preserve">Agent 4 — Audio playback &amp; favourites</w:t>
       </w:r>
     </w:p>
     <w:tbl>
@@ -3653,73 +3772,13 @@
           <w:p>
             <w:r>
               <w:rPr>
-                <w:i/>
-                <w:iCs/>
-                <w:color w:val="888888"/>
-                <w:sz w:val="22"/>
-                <w:szCs w:val="22"/>
-              </w:rPr>
-              <w:t xml:space="preserve">→ vul in</w:t>
-            </w:r>
-          </w:p>
-        </w:tc>
-      </w:tr>
-      <w:tr>
-        <w:tc>
-          <w:tcPr>
-            <w:tcW w:type="dxa" w:w="2500"/>
-            <w:tcBorders>
-              <w:top w:val="single" w:color="CCCCCC" w:sz="1"/>
-              <w:left w:val="single" w:color="CCCCCC" w:sz="1"/>
-              <w:bottom w:val="single" w:color="CCCCCC" w:sz="1"/>
-              <w:right w:val="single" w:color="CCCCCC" w:sz="1"/>
-            </w:tcBorders>
-            <w:shd w:fill="EEF3FA" w:val="clear"/>
-            <w:tcMar>
-              <w:top w:type="dxa" w:w="80"/>
-              <w:left w:type="dxa" w:w="120"/>
-              <w:bottom w:type="dxa" w:w="80"/>
-              <w:right w:type="dxa" w:w="120"/>
-            </w:tcMar>
-          </w:tcPr>
-          <w:p>
-            <w:r>
-              <w:rPr>
-                <w:b/>
-                <w:bCs/>
-                <w:sz w:val="22"/>
-                <w:szCs w:val="22"/>
-              </w:rPr>
-              <w:t xml:space="preserve">Tool / model</w:t>
-            </w:r>
-          </w:p>
-        </w:tc>
-        <w:tc>
-          <w:tcPr>
-            <w:tcW w:type="dxa" w:w="6526"/>
-            <w:tcBorders>
-              <w:top w:val="single" w:color="CCCCCC" w:sz="1"/>
-              <w:left w:val="single" w:color="CCCCCC" w:sz="1"/>
-              <w:bottom w:val="single" w:color="CCCCCC" w:sz="1"/>
-              <w:right w:val="single" w:color="CCCCCC" w:sz="1"/>
-            </w:tcBorders>
-            <w:tcMar>
-              <w:top w:type="dxa" w:w="80"/>
-              <w:left w:type="dxa" w:w="120"/>
-              <w:bottom w:type="dxa" w:w="80"/>
-              <w:right w:type="dxa" w:w="120"/>
-            </w:tcMar>
-          </w:tcPr>
-          <w:p>
-            <w:r>
-              <w:rPr>
                 <w:i w:val="false"/>
                 <w:iCs w:val="false"/>
                 <w:color w:val="000000"/>
                 <w:sz w:val="22"/>
                 <w:szCs w:val="22"/>
               </w:rPr>
-              <w:t xml:space="preserve">Claude Code</w:t>
+              <w:t xml:space="preserve">Audio playback via de play-knop, favourites lijst beheren en weergeven</w:t>
             </w:r>
           </w:p>
         </w:tc>
@@ -3750,6 +3809,66 @@
                 <w:sz w:val="22"/>
                 <w:szCs w:val="22"/>
               </w:rPr>
+              <w:t xml:space="preserve">Tool / model</w:t>
+            </w:r>
+          </w:p>
+        </w:tc>
+        <w:tc>
+          <w:tcPr>
+            <w:tcW w:type="dxa" w:w="6526"/>
+            <w:tcBorders>
+              <w:top w:val="single" w:color="CCCCCC" w:sz="1"/>
+              <w:left w:val="single" w:color="CCCCCC" w:sz="1"/>
+              <w:bottom w:val="single" w:color="CCCCCC" w:sz="1"/>
+              <w:right w:val="single" w:color="CCCCCC" w:sz="1"/>
+            </w:tcBorders>
+            <w:tcMar>
+              <w:top w:type="dxa" w:w="80"/>
+              <w:left w:type="dxa" w:w="120"/>
+              <w:bottom w:type="dxa" w:w="80"/>
+              <w:right w:type="dxa" w:w="120"/>
+            </w:tcMar>
+          </w:tcPr>
+          <w:p>
+            <w:r>
+              <w:rPr>
+                <w:i w:val="false"/>
+                <w:iCs w:val="false"/>
+                <w:color w:val="000000"/>
+                <w:sz w:val="22"/>
+                <w:szCs w:val="22"/>
+              </w:rPr>
+              <w:t xml:space="preserve">Claude Code</w:t>
+            </w:r>
+          </w:p>
+        </w:tc>
+      </w:tr>
+      <w:tr>
+        <w:tc>
+          <w:tcPr>
+            <w:tcW w:type="dxa" w:w="2500"/>
+            <w:tcBorders>
+              <w:top w:val="single" w:color="CCCCCC" w:sz="1"/>
+              <w:left w:val="single" w:color="CCCCCC" w:sz="1"/>
+              <w:bottom w:val="single" w:color="CCCCCC" w:sz="1"/>
+              <w:right w:val="single" w:color="CCCCCC" w:sz="1"/>
+            </w:tcBorders>
+            <w:shd w:fill="EEF3FA" w:val="clear"/>
+            <w:tcMar>
+              <w:top w:type="dxa" w:w="80"/>
+              <w:left w:type="dxa" w:w="120"/>
+              <w:bottom w:type="dxa" w:w="80"/>
+              <w:right w:type="dxa" w:w="120"/>
+            </w:tcMar>
+          </w:tcPr>
+          <w:p>
+            <w:r>
+              <w:rPr>
+                <w:b/>
+                <w:bCs/>
+                <w:sz w:val="22"/>
+                <w:szCs w:val="22"/>
+              </w:rPr>
               <w:t xml:space="preserve">Modus</w:t>
             </w:r>
           </w:p>
@@ -3771,15 +3890,119 @@
             </w:tcMar>
           </w:tcPr>
           <w:p>
+            <w:r>
+              <w:rPr>
+                <w:i w:val="false"/>
+                <w:iCs w:val="false"/>
+                <w:color w:val="000000"/>
+                <w:sz w:val="22"/>
+                <w:szCs w:val="22"/>
+              </w:rPr>
+              <w:t xml:space="preserve">edit</w:t>
+            </w:r>
+          </w:p>
+        </w:tc>
+      </w:tr>
+      <w:tr>
+        <w:tc>
+          <w:tcPr>
+            <w:tcW w:type="dxa" w:w="2500"/>
+            <w:tcBorders>
+              <w:top w:val="single" w:color="CCCCCC" w:sz="1"/>
+              <w:left w:val="single" w:color="CCCCCC" w:sz="1"/>
+              <w:bottom w:val="single" w:color="CCCCCC" w:sz="1"/>
+              <w:right w:val="single" w:color="CCCCCC" w:sz="1"/>
+            </w:tcBorders>
+            <w:shd w:fill="EEF3FA" w:val="clear"/>
+            <w:tcMar>
+              <w:top w:type="dxa" w:w="80"/>
+              <w:left w:type="dxa" w:w="120"/>
+              <w:bottom w:type="dxa" w:w="80"/>
+              <w:right w:type="dxa" w:w="120"/>
+            </w:tcMar>
+          </w:tcPr>
+          <w:p>
+            <w:r>
+              <w:rPr>
+                <w:b/>
+                <w:bCs/>
+                <w:sz w:val="22"/>
+                <w:szCs w:val="22"/>
+              </w:rPr>
+              <w:t xml:space="preserve">Prompts gesteld</w:t>
+            </w:r>
+          </w:p>
+        </w:tc>
+        <w:tc>
+          <w:tcPr>
+            <w:tcW w:type="dxa" w:w="6526"/>
+            <w:tcBorders>
+              <w:top w:val="single" w:color="CCCCCC" w:sz="1"/>
+              <w:left w:val="single" w:color="CCCCCC" w:sz="1"/>
+              <w:bottom w:val="single" w:color="CCCCCC" w:sz="1"/>
+              <w:right w:val="single" w:color="CCCCCC" w:sz="1"/>
+            </w:tcBorders>
+            <w:tcMar>
+              <w:top w:type="dxa" w:w="80"/>
+              <w:left w:type="dxa" w:w="120"/>
+              <w:bottom w:type="dxa" w:w="80"/>
+              <w:right w:type="dxa" w:w="120"/>
+            </w:tcMar>
+          </w:tcPr>
+          <w:p>
+            <w:pPr>
+              <w:spacing w:after="40"/>
+            </w:pPr>
+            <w:r>
+              <w:rPr>
+                <w:b/>
+                <w:bCs/>
+                <w:sz w:val="22"/>
+                <w:szCs w:val="22"/>
+              </w:rPr>
+              <w:t xml:space="preserve">Prompt 1 — hoofdfunctionaliteit:</w:t>
+            </w:r>
+          </w:p>
+          <w:p>
+            <w:pPr>
+              <w:spacing w:after="40"/>
+            </w:pPr>
             <w:r>
               <w:rPr>
                 <w:i/>
                 <w:iCs/>
-                <w:color w:val="888888"/>
-                <w:sz w:val="22"/>
-                <w:szCs w:val="22"/>
-              </w:rPr>
-              <w:t xml:space="preserve">→ edit</w:t>
+                <w:sz w:val="22"/>
+                <w:szCs w:val="22"/>
+              </w:rPr>
+              <w:t xml:space="preserve">For chapter 2 I want from you to play the sounds when user clicks on btnPlay, also create a list for when songs are added to favorites and display them inside here: lstFavourites same way as we did for the search results, remove the emptyState as well when there's at least one song, update the count: spnFavouritesCount. When I click on play, the song should play, when user selects another song the sound should pause. For the favorites the user should be able to add it to fav and remove it from over there when active the heart should be filled in white.</w:t>
+            </w:r>
+          </w:p>
+          <w:p>
+            <w:pPr>
+              <w:spacing w:after="40"/>
+            </w:pPr>
+            <w:r>
+              <w:rPr>
+                <w:b/>
+                <w:bCs/>
+                <w:sz w:val="22"/>
+                <w:szCs w:val="22"/>
+              </w:rPr>
+              <w:t xml:space="preserve">Prompt 2 — bugfix:</w:t>
+            </w:r>
+          </w:p>
+          <w:p>
+            <w:pPr>
+              <w:spacing w:after="40"/>
+            </w:pPr>
+            <w:r>
+              <w:rPr>
+                <w:i/>
+                <w:iCs/>
+                <w:sz w:val="22"/>
+                <w:szCs w:val="22"/>
+              </w:rPr>
+              <w:t xml:space="preserve">When I select a song from the favourites and deselect it from the banner I can't add it back, there's a bug over there. Look why and explain. Also change the icon from play to pause when playing or stopping a song.</w:t>
             </w:r>
           </w:p>
         </w:tc>
@@ -3810,7 +4033,7 @@
                 <w:sz w:val="22"/>
                 <w:szCs w:val="22"/>
               </w:rPr>
-              <w:t xml:space="preserve">Prompts gesteld</w:t>
+              <w:t xml:space="preserve">Bijsturingen</w:t>
             </w:r>
           </w:p>
         </w:tc>
@@ -3831,15 +4054,71 @@
             </w:tcMar>
           </w:tcPr>
           <w:p>
-            <w:r>
-              <w:rPr>
-                <w:i/>
-                <w:iCs/>
-                <w:color w:val="888888"/>
-                <w:sz w:val="22"/>
-                <w:szCs w:val="22"/>
-              </w:rPr>
-              <w:t xml:space="preserve">→ vul in</w:t>
+            <w:pPr>
+              <w:pStyle w:val="ListParagraph"/>
+              <w:numPr>
+                <w:ilvl w:val="0"/>
+                <w:numId w:val="2"/>
+              </w:numPr>
+              <w:spacing w:after="40"/>
+            </w:pPr>
+            <w:r>
+              <w:rPr>
+                <w:sz w:val="22"/>
+                <w:szCs w:val="22"/>
+              </w:rPr>
+              <w:t xml:space="preserve">Favourites grid omgezet naar flex met overflow-y scroll — grid 3 cols was niet gewenst.</w:t>
+            </w:r>
+          </w:p>
+          <w:p>
+            <w:pPr>
+              <w:pStyle w:val="ListParagraph"/>
+              <w:numPr>
+                <w:ilvl w:val="0"/>
+                <w:numId w:val="2"/>
+              </w:numPr>
+              <w:spacing w:after="40"/>
+            </w:pPr>
+            <w:r>
+              <w:rPr>
+                <w:sz w:val="22"/>
+                <w:szCs w:val="22"/>
+              </w:rPr>
+              <w:t xml:space="preserve">Bug via Claude gefixed: geselecteerd fav kon na deselectie niet opnieuw toegevoegd worden + play/pause icon wisselt correct.</w:t>
+            </w:r>
+          </w:p>
+          <w:p>
+            <w:pPr>
+              <w:pStyle w:val="ListParagraph"/>
+              <w:numPr>
+                <w:ilvl w:val="0"/>
+                <w:numId w:val="2"/>
+              </w:numPr>
+              <w:spacing w:after="40"/>
+            </w:pPr>
+            <w:r>
+              <w:rPr>
+                <w:sz w:val="22"/>
+                <w:szCs w:val="22"/>
+              </w:rPr>
+              <w:t xml:space="preserve">Manueel: 'remove all favourites' knop toegevoegd als extra JS feature.</w:t>
+            </w:r>
+          </w:p>
+          <w:p>
+            <w:pPr>
+              <w:pStyle w:val="ListParagraph"/>
+              <w:numPr>
+                <w:ilvl w:val="0"/>
+                <w:numId w:val="2"/>
+              </w:numPr>
+              <w:spacing w:after="40"/>
+            </w:pPr>
+            <w:r>
+              <w:rPr>
+                <w:sz w:val="22"/>
+                <w:szCs w:val="22"/>
+              </w:rPr>
+              <w:t xml:space="preserve">Manueel: syncPlayBtn aangeroepen om play-knop te syncronen bij wisselen van song zonder afspelen.</w:t>
             </w:r>
           </w:p>
         </w:tc>
@@ -3870,7 +4149,7 @@
                 <w:sz w:val="22"/>
                 <w:szCs w:val="22"/>
               </w:rPr>
-              <w:t xml:space="preserve">Bijsturingen</w:t>
+              <w:t xml:space="preserve">Resultaat</w:t>
             </w:r>
           </w:p>
         </w:tc>
@@ -3893,73 +4172,13 @@
           <w:p>
             <w:r>
               <w:rPr>
-                <w:i/>
-                <w:iCs/>
-                <w:color w:val="888888"/>
-                <w:sz w:val="22"/>
-                <w:szCs w:val="22"/>
-              </w:rPr>
-              <w:t xml:space="preserve">→ vul in</w:t>
-            </w:r>
-          </w:p>
-        </w:tc>
-      </w:tr>
-      <w:tr>
-        <w:tc>
-          <w:tcPr>
-            <w:tcW w:type="dxa" w:w="2500"/>
-            <w:tcBorders>
-              <w:top w:val="single" w:color="CCCCCC" w:sz="1"/>
-              <w:left w:val="single" w:color="CCCCCC" w:sz="1"/>
-              <w:bottom w:val="single" w:color="CCCCCC" w:sz="1"/>
-              <w:right w:val="single" w:color="CCCCCC" w:sz="1"/>
-            </w:tcBorders>
-            <w:shd w:fill="EEF3FA" w:val="clear"/>
-            <w:tcMar>
-              <w:top w:type="dxa" w:w="80"/>
-              <w:left w:type="dxa" w:w="120"/>
-              <w:bottom w:type="dxa" w:w="80"/>
-              <w:right w:type="dxa" w:w="120"/>
-            </w:tcMar>
-          </w:tcPr>
-          <w:p>
-            <w:r>
-              <w:rPr>
-                <w:b/>
-                <w:bCs/>
-                <w:sz w:val="22"/>
-                <w:szCs w:val="22"/>
-              </w:rPr>
-              <w:t xml:space="preserve">Resultaat</w:t>
-            </w:r>
-          </w:p>
-        </w:tc>
-        <w:tc>
-          <w:tcPr>
-            <w:tcW w:type="dxa" w:w="6526"/>
-            <w:tcBorders>
-              <w:top w:val="single" w:color="CCCCCC" w:sz="1"/>
-              <w:left w:val="single" w:color="CCCCCC" w:sz="1"/>
-              <w:bottom w:val="single" w:color="CCCCCC" w:sz="1"/>
-              <w:right w:val="single" w:color="CCCCCC" w:sz="1"/>
-            </w:tcBorders>
-            <w:tcMar>
-              <w:top w:type="dxa" w:w="80"/>
-              <w:left w:type="dxa" w:w="120"/>
-              <w:bottom w:type="dxa" w:w="80"/>
-              <w:right w:type="dxa" w:w="120"/>
-            </w:tcMar>
-          </w:tcPr>
-          <w:p>
-            <w:r>
-              <w:rPr>
-                <w:i/>
-                <w:iCs/>
-                <w:color w:val="888888"/>
-                <w:sz w:val="22"/>
-                <w:szCs w:val="22"/>
-              </w:rPr>
-              <w:t xml:space="preserve">→ vul in</w:t>
+                <w:i w:val="false"/>
+                <w:iCs w:val="false"/>
+                <w:color w:val="000000"/>
+                <w:sz w:val="22"/>
+                <w:szCs w:val="22"/>
+              </w:rPr>
+              <w:t xml:space="preserve">Audio playback werkt, favourites worden beheerd en weergegeven. Commit: feat: audio playback &amp; favourites</w:t>
             </w:r>
           </w:p>
         </w:tc>

</xml_diff>

<commit_message>
feat: localStorage persistence — favourites & last played
</commit_message>
<xml_diff>
--- a/documentatie.docx
+++ b/documentatie.docx
@@ -225,13 +225,13 @@
           <w:p>
             <w:r>
               <w:rPr>
-                <w:i/>
-                <w:iCs/>
-                <w:color w:val="888888"/>
-                <w:sz w:val="22"/>
-                <w:szCs w:val="22"/>
-              </w:rPr>
-              <w:t xml:space="preserve">→ vul in</w:t>
+                <w:i w:val="false"/>
+                <w:iCs w:val="false"/>
+                <w:color w:val="000000"/>
+                <w:sz w:val="22"/>
+                <w:szCs w:val="22"/>
+              </w:rPr>
+              <w:t xml:space="preserve">Mimoun Atmani</w:t>
             </w:r>
           </w:p>
         </w:tc>
@@ -1973,7 +1973,7 @@
                 <w:sz w:val="22"/>
                 <w:szCs w:val="22"/>
               </w:rPr>
-              <w:t xml:space="preserve">Claude Code</w:t>
+              <w:t xml:space="preserve">Claude Code (claude-opus-4-5)</w:t>
             </w:r>
           </w:p>
         </w:tc>
@@ -2423,7 +2423,7 @@
                 <w:sz w:val="22"/>
                 <w:szCs w:val="22"/>
               </w:rPr>
-              <w:t xml:space="preserve">Claude Code</w:t>
+              <w:t xml:space="preserve">Claude Code (claude-opus-4-5)</w:t>
             </w:r>
           </w:p>
         </w:tc>
@@ -3266,7 +3266,7 @@
                 <w:sz w:val="22"/>
                 <w:szCs w:val="22"/>
               </w:rPr>
-              <w:t xml:space="preserve">Claude Code</w:t>
+              <w:t xml:space="preserve">Claude Code (claude-opus-4-5)</w:t>
             </w:r>
           </w:p>
         </w:tc>
@@ -3838,7 +3838,7 @@
                 <w:sz w:val="22"/>
                 <w:szCs w:val="22"/>
               </w:rPr>
-              <w:t xml:space="preserve">Claude Code</w:t>
+              <w:t xml:space="preserve">Claude Code (claude-opus-4-5)</w:t>
             </w:r>
           </w:p>
         </w:tc>
@@ -4197,7 +4197,7 @@
         <w:pStyle w:val="Heading2"/>
       </w:pPr>
       <w:r>
-        <w:t xml:space="preserve">Agent 5 — Dashboard &amp; localStorage</w:t>
+        <w:t xml:space="preserve">Agent 5 — localStorage persistentie</w:t>
       </w:r>
     </w:p>
     <w:tbl>
@@ -4325,73 +4325,13 @@
           <w:p>
             <w:r>
               <w:rPr>
-                <w:i/>
-                <w:iCs/>
-                <w:color w:val="888888"/>
-                <w:sz w:val="22"/>
-                <w:szCs w:val="22"/>
-              </w:rPr>
-              <w:t xml:space="preserve">→ vul in</w:t>
-            </w:r>
-          </w:p>
-        </w:tc>
-      </w:tr>
-      <w:tr>
-        <w:tc>
-          <w:tcPr>
-            <w:tcW w:type="dxa" w:w="2500"/>
-            <w:tcBorders>
-              <w:top w:val="single" w:color="CCCCCC" w:sz="1"/>
-              <w:left w:val="single" w:color="CCCCCC" w:sz="1"/>
-              <w:bottom w:val="single" w:color="CCCCCC" w:sz="1"/>
-              <w:right w:val="single" w:color="CCCCCC" w:sz="1"/>
-            </w:tcBorders>
-            <w:shd w:fill="EEF3FA" w:val="clear"/>
-            <w:tcMar>
-              <w:top w:type="dxa" w:w="80"/>
-              <w:left w:type="dxa" w:w="120"/>
-              <w:bottom w:type="dxa" w:w="80"/>
-              <w:right w:type="dxa" w:w="120"/>
-            </w:tcMar>
-          </w:tcPr>
-          <w:p>
-            <w:r>
-              <w:rPr>
-                <w:b/>
-                <w:bCs/>
-                <w:sz w:val="22"/>
-                <w:szCs w:val="22"/>
-              </w:rPr>
-              <w:t xml:space="preserve">Tool / model</w:t>
-            </w:r>
-          </w:p>
-        </w:tc>
-        <w:tc>
-          <w:tcPr>
-            <w:tcW w:type="dxa" w:w="6526"/>
-            <w:tcBorders>
-              <w:top w:val="single" w:color="CCCCCC" w:sz="1"/>
-              <w:left w:val="single" w:color="CCCCCC" w:sz="1"/>
-              <w:bottom w:val="single" w:color="CCCCCC" w:sz="1"/>
-              <w:right w:val="single" w:color="CCCCCC" w:sz="1"/>
-            </w:tcBorders>
-            <w:tcMar>
-              <w:top w:type="dxa" w:w="80"/>
-              <w:left w:type="dxa" w:w="120"/>
-              <w:bottom w:type="dxa" w:w="80"/>
-              <w:right w:type="dxa" w:w="120"/>
-            </w:tcMar>
-          </w:tcPr>
-          <w:p>
-            <w:r>
-              <w:rPr>
                 <w:i w:val="false"/>
                 <w:iCs w:val="false"/>
                 <w:color w:val="000000"/>
                 <w:sz w:val="22"/>
                 <w:szCs w:val="22"/>
               </w:rPr>
-              <w:t xml:space="preserve">Claude Code</w:t>
+              <w:t xml:space="preserve">localStorage persistentie — favourites array en last played sound bewaren en herstellen</w:t>
             </w:r>
           </w:p>
         </w:tc>
@@ -4422,6 +4362,66 @@
                 <w:sz w:val="22"/>
                 <w:szCs w:val="22"/>
               </w:rPr>
+              <w:t xml:space="preserve">Tool / model</w:t>
+            </w:r>
+          </w:p>
+        </w:tc>
+        <w:tc>
+          <w:tcPr>
+            <w:tcW w:type="dxa" w:w="6526"/>
+            <w:tcBorders>
+              <w:top w:val="single" w:color="CCCCCC" w:sz="1"/>
+              <w:left w:val="single" w:color="CCCCCC" w:sz="1"/>
+              <w:bottom w:val="single" w:color="CCCCCC" w:sz="1"/>
+              <w:right w:val="single" w:color="CCCCCC" w:sz="1"/>
+            </w:tcBorders>
+            <w:tcMar>
+              <w:top w:type="dxa" w:w="80"/>
+              <w:left w:type="dxa" w:w="120"/>
+              <w:bottom w:type="dxa" w:w="80"/>
+              <w:right w:type="dxa" w:w="120"/>
+            </w:tcMar>
+          </w:tcPr>
+          <w:p>
+            <w:r>
+              <w:rPr>
+                <w:i w:val="false"/>
+                <w:iCs w:val="false"/>
+                <w:color w:val="000000"/>
+                <w:sz w:val="22"/>
+                <w:szCs w:val="22"/>
+              </w:rPr>
+              <w:t xml:space="preserve">Claude Code (claude-opus-4-5)</w:t>
+            </w:r>
+          </w:p>
+        </w:tc>
+      </w:tr>
+      <w:tr>
+        <w:tc>
+          <w:tcPr>
+            <w:tcW w:type="dxa" w:w="2500"/>
+            <w:tcBorders>
+              <w:top w:val="single" w:color="CCCCCC" w:sz="1"/>
+              <w:left w:val="single" w:color="CCCCCC" w:sz="1"/>
+              <w:bottom w:val="single" w:color="CCCCCC" w:sz="1"/>
+              <w:right w:val="single" w:color="CCCCCC" w:sz="1"/>
+            </w:tcBorders>
+            <w:shd w:fill="EEF3FA" w:val="clear"/>
+            <w:tcMar>
+              <w:top w:type="dxa" w:w="80"/>
+              <w:left w:type="dxa" w:w="120"/>
+              <w:bottom w:type="dxa" w:w="80"/>
+              <w:right w:type="dxa" w:w="120"/>
+            </w:tcMar>
+          </w:tcPr>
+          <w:p>
+            <w:r>
+              <w:rPr>
+                <w:b/>
+                <w:bCs/>
+                <w:sz w:val="22"/>
+                <w:szCs w:val="22"/>
+              </w:rPr>
               <w:t xml:space="preserve">Modus</w:t>
             </w:r>
           </w:p>
@@ -4443,15 +4443,77 @@
             </w:tcMar>
           </w:tcPr>
           <w:p>
+            <w:r>
+              <w:rPr>
+                <w:i w:val="false"/>
+                <w:iCs w:val="false"/>
+                <w:color w:val="000000"/>
+                <w:sz w:val="22"/>
+                <w:szCs w:val="22"/>
+              </w:rPr>
+              <w:t xml:space="preserve">edit</w:t>
+            </w:r>
+          </w:p>
+        </w:tc>
+      </w:tr>
+      <w:tr>
+        <w:tc>
+          <w:tcPr>
+            <w:tcW w:type="dxa" w:w="2500"/>
+            <w:tcBorders>
+              <w:top w:val="single" w:color="CCCCCC" w:sz="1"/>
+              <w:left w:val="single" w:color="CCCCCC" w:sz="1"/>
+              <w:bottom w:val="single" w:color="CCCCCC" w:sz="1"/>
+              <w:right w:val="single" w:color="CCCCCC" w:sz="1"/>
+            </w:tcBorders>
+            <w:shd w:fill="EEF3FA" w:val="clear"/>
+            <w:tcMar>
+              <w:top w:type="dxa" w:w="80"/>
+              <w:left w:type="dxa" w:w="120"/>
+              <w:bottom w:type="dxa" w:w="80"/>
+              <w:right w:type="dxa" w:w="120"/>
+            </w:tcMar>
+          </w:tcPr>
+          <w:p>
+            <w:r>
+              <w:rPr>
+                <w:b/>
+                <w:bCs/>
+                <w:sz w:val="22"/>
+                <w:szCs w:val="22"/>
+              </w:rPr>
+              <w:t xml:space="preserve">Prompts gesteld</w:t>
+            </w:r>
+          </w:p>
+        </w:tc>
+        <w:tc>
+          <w:tcPr>
+            <w:tcW w:type="dxa" w:w="6526"/>
+            <w:tcBorders>
+              <w:top w:val="single" w:color="CCCCCC" w:sz="1"/>
+              <w:left w:val="single" w:color="CCCCCC" w:sz="1"/>
+              <w:bottom w:val="single" w:color="CCCCCC" w:sz="1"/>
+              <w:right w:val="single" w:color="CCCCCC" w:sz="1"/>
+            </w:tcBorders>
+            <w:tcMar>
+              <w:top w:type="dxa" w:w="80"/>
+              <w:left w:type="dxa" w:w="120"/>
+              <w:bottom w:type="dxa" w:w="80"/>
+              <w:right w:type="dxa" w:w="120"/>
+            </w:tcMar>
+          </w:tcPr>
+          <w:p>
+            <w:pPr>
+              <w:spacing w:after="40"/>
+            </w:pPr>
             <w:r>
               <w:rPr>
                 <w:i/>
                 <w:iCs/>
-                <w:color w:val="888888"/>
-                <w:sz w:val="22"/>
-                <w:szCs w:val="22"/>
-              </w:rPr>
-              <w:t xml:space="preserve">→ edit</w:t>
+                <w:sz w:val="22"/>
+                <w:szCs w:val="22"/>
+              </w:rPr>
+              <w:t xml:space="preserve">add localStorage persistence. Favourites: save the favourites array to localStorage every time a favourite is added or removed, including when 'remove all' is used. On page load, read from localStorage and render the existing favourites into lstFavourites, update spnFavouritesCount and remove the empty state if needed. Last played: save currentSound to localStorage whenever it changes. On page load, read it and restore the now playing banner with the last played sound's data (title, username, waveform image). Do not auto-play it — just display it. No new UI needed, just the persistence logic.</w:t>
             </w:r>
           </w:p>
         </w:tc>
@@ -4482,7 +4544,7 @@
                 <w:sz w:val="22"/>
                 <w:szCs w:val="22"/>
               </w:rPr>
-              <w:t xml:space="preserve">Prompts gesteld</w:t>
+              <w:t xml:space="preserve">Bijsturingen</w:t>
             </w:r>
           </w:p>
         </w:tc>
@@ -4505,13 +4567,13 @@
           <w:p>
             <w:r>
               <w:rPr>
-                <w:i/>
-                <w:iCs/>
-                <w:color w:val="888888"/>
-                <w:sz w:val="22"/>
-                <w:szCs w:val="22"/>
-              </w:rPr>
-              <w:t xml:space="preserve">→ vul in</w:t>
+                <w:i w:val="false"/>
+                <w:iCs w:val="false"/>
+                <w:color w:val="000000"/>
+                <w:sz w:val="22"/>
+                <w:szCs w:val="22"/>
+              </w:rPr>
+              <w:t xml:space="preserve">/</w:t>
             </w:r>
           </w:p>
         </w:tc>
@@ -4542,7 +4604,7 @@
                 <w:sz w:val="22"/>
                 <w:szCs w:val="22"/>
               </w:rPr>
-              <w:t xml:space="preserve">Bijsturingen</w:t>
+              <w:t xml:space="preserve">Resultaat</w:t>
             </w:r>
           </w:p>
         </w:tc>
@@ -4565,73 +4627,13 @@
           <w:p>
             <w:r>
               <w:rPr>
-                <w:i/>
-                <w:iCs/>
-                <w:color w:val="888888"/>
-                <w:sz w:val="22"/>
-                <w:szCs w:val="22"/>
-              </w:rPr>
-              <w:t xml:space="preserve">→ vul in</w:t>
-            </w:r>
-          </w:p>
-        </w:tc>
-      </w:tr>
-      <w:tr>
-        <w:tc>
-          <w:tcPr>
-            <w:tcW w:type="dxa" w:w="2500"/>
-            <w:tcBorders>
-              <w:top w:val="single" w:color="CCCCCC" w:sz="1"/>
-              <w:left w:val="single" w:color="CCCCCC" w:sz="1"/>
-              <w:bottom w:val="single" w:color="CCCCCC" w:sz="1"/>
-              <w:right w:val="single" w:color="CCCCCC" w:sz="1"/>
-            </w:tcBorders>
-            <w:shd w:fill="EEF3FA" w:val="clear"/>
-            <w:tcMar>
-              <w:top w:type="dxa" w:w="80"/>
-              <w:left w:type="dxa" w:w="120"/>
-              <w:bottom w:type="dxa" w:w="80"/>
-              <w:right w:type="dxa" w:w="120"/>
-            </w:tcMar>
-          </w:tcPr>
-          <w:p>
-            <w:r>
-              <w:rPr>
-                <w:b/>
-                <w:bCs/>
-                <w:sz w:val="22"/>
-                <w:szCs w:val="22"/>
-              </w:rPr>
-              <w:t xml:space="preserve">Resultaat</w:t>
-            </w:r>
-          </w:p>
-        </w:tc>
-        <w:tc>
-          <w:tcPr>
-            <w:tcW w:type="dxa" w:w="6526"/>
-            <w:tcBorders>
-              <w:top w:val="single" w:color="CCCCCC" w:sz="1"/>
-              <w:left w:val="single" w:color="CCCCCC" w:sz="1"/>
-              <w:bottom w:val="single" w:color="CCCCCC" w:sz="1"/>
-              <w:right w:val="single" w:color="CCCCCC" w:sz="1"/>
-            </w:tcBorders>
-            <w:tcMar>
-              <w:top w:type="dxa" w:w="80"/>
-              <w:left w:type="dxa" w:w="120"/>
-              <w:bottom w:type="dxa" w:w="80"/>
-              <w:right w:type="dxa" w:w="120"/>
-            </w:tcMar>
-          </w:tcPr>
-          <w:p>
-            <w:r>
-              <w:rPr>
-                <w:i/>
-                <w:iCs/>
-                <w:color w:val="888888"/>
-                <w:sz w:val="22"/>
-                <w:szCs w:val="22"/>
-              </w:rPr>
-              <w:t xml:space="preserve">→ vul in</w:t>
+                <w:i w:val="false"/>
+                <w:iCs w:val="false"/>
+                <w:color w:val="000000"/>
+                <w:sz w:val="22"/>
+                <w:szCs w:val="22"/>
+              </w:rPr>
+              <w:t xml:space="preserve">Favourites en last played worden correct opgeslagen en hersteld via localStorage. Geen bijsturingen nodig. Commit: feat: localStorage persistence — favourites &amp; last played</w:t>
             </w:r>
           </w:p>
         </w:tc>
@@ -4684,17 +4686,94 @@
     </w:p>
     <w:p>
       <w:pPr>
-        <w:shd w:fill="F5F5F5" w:val="clear"/>
-        <w:spacing w:after="160" w:before="80"/>
-        <w:ind w:left="360"/>
+        <w:spacing w:after="120"/>
+      </w:pPr>
+      <w:r>
+        <w:t xml:space="preserve">Claude Opus presteerde uitstekend doorheen het hele project. De prompts hoefden niet overdreven precies te zijn — Claude begreep de context snel en leverde bruikbare output af. Dit zorgde voor een vlotte workflow waarbij de focus op de eigenlijke implementatie kon liggen in plaats van op het bijsturen van de AI.</w:t>
+      </w:r>
+    </w:p>
+    <w:p>
+      <w:pPr>
+        <w:spacing w:after="120"/>
+      </w:pPr>
+      <w:r>
+        <w:t xml:space="preserve"/>
+      </w:r>
+    </w:p>
+    <w:p>
+      <w:pPr>
+        <w:pStyle w:val="Heading2"/>
+      </w:pPr>
+      <w:r>
+        <w:t xml:space="preserve">5.2 Wat werkte minder goed</w:t>
+      </w:r>
+    </w:p>
+    <w:p>
+      <w:pPr>
+        <w:spacing w:after="120"/>
+      </w:pPr>
+      <w:r>
+        <w:t xml:space="preserve">Er waren geen grote struikelblokken. Wanneer Claude iets over het hoofd zag, kon ik het snel zelf oplossen omdat ik mijn eigen codebase goed ken en weet wat er nodig is. Bij complexere bugs heb ik Claude zelf laten zoeken door hem naar het probleem te wijzen, wat telkens vlot opgelost werd.</w:t>
+      </w:r>
+    </w:p>
+    <w:p>
+      <w:pPr>
+        <w:spacing w:after="120"/>
+      </w:pPr>
+      <w:r>
+        <w:t xml:space="preserve"/>
+      </w:r>
+    </w:p>
+    <w:p>
+      <w:pPr>
+        <w:pStyle w:val="Heading2"/>
+      </w:pPr>
+      <w:r>
+        <w:t xml:space="preserve">5.3 Wat heb je bijgeleerd</w:t>
+      </w:r>
+    </w:p>
+    <w:p>
+      <w:pPr>
+        <w:spacing w:after="120"/>
+      </w:pPr>
+      <w:r>
+        <w:t xml:space="preserve">Niet zoveel nieuws op technisch vlak — ik werk al twee jaar met Claude als aanvulling op mijn eigen kennis, dat is voor mij de beste manier om te groeien als developer. AI vervangt niemand, maar wie het goed leert inzetten heeft een duidelijk voordeel.</w:t>
+      </w:r>
+    </w:p>
+    <w:p>
+      <w:pPr>
+        <w:spacing w:after="120"/>
+      </w:pPr>
+      <w:r>
+        <w:t xml:space="preserve"/>
+      </w:r>
+    </w:p>
+    <w:p>
+      <w:pPr>
+        <w:spacing w:after="120"/>
+      </w:pPr>
+      <w:r>
+        <w:t xml:space="preserve">Wat wel opviel tijdens dit project is hoe veel werk frameworks zoals React ons besparen. Zo had ik op meerdere plaatsen een syncPlayBtn functie nodig om de UI in sync te houden met de state — iets wat in React triviaal is met een dependency array in useEffect. In vanilla JS loopt zoiets snel uit de hand naarmate de codebase groeit.</w:t>
+      </w:r>
+    </w:p>
+    <w:p>
+      <w:pPr>
+        <w:spacing w:after="120"/>
+      </w:pPr>
+      <w:r>
+        <w:t xml:space="preserve"/>
+      </w:r>
+    </w:p>
+    <w:p>
+      <w:pPr>
+        <w:spacing w:after="120"/>
       </w:pPr>
       <w:r>
         <w:rPr>
           <w:i/>
           <w:iCs/>
-          <w:color w:val="888888"/>
-        </w:rPr>
-        <w:t xml:space="preserve">→ vul in na afronding van het project</w:t>
+        </w:rPr>
+        <w:t xml:space="preserve">Over het algemeen ben ik tevreden met het eindresultaat — het project voldoet aan de verwachtingen en de aanpak voelde natuurlijk aan.</w:t>
       </w:r>
     </w:p>
     <w:p>
@@ -4710,22 +4789,7 @@
         <w:pStyle w:val="Heading2"/>
       </w:pPr>
       <w:r>
-        <w:t xml:space="preserve">5.2 Wat werkte minder goed</w:t>
-      </w:r>
-    </w:p>
-    <w:p>
-      <w:pPr>
-        <w:shd w:fill="F5F5F5" w:val="clear"/>
-        <w:spacing w:after="160" w:before="80"/>
-        <w:ind w:left="360"/>
-      </w:pPr>
-      <w:r>
-        <w:rPr>
-          <w:i/>
-          <w:iCs/>
-          <w:color w:val="888888"/>
-        </w:rPr>
-        <w:t xml:space="preserve">→ vul in na afronding van het project</w:t>
+        <w:t xml:space="preserve">5.4 Opmerking — API key beheer</w:t>
       </w:r>
     </w:p>
     <w:p>
@@ -4733,30 +4797,7 @@
         <w:spacing w:after="120"/>
       </w:pPr>
       <w:r>
-        <w:t xml:space="preserve"/>
-      </w:r>
-    </w:p>
-    <w:p>
-      <w:pPr>
-        <w:pStyle w:val="Heading2"/>
-      </w:pPr>
-      <w:r>
-        <w:t xml:space="preserve">5.3 Wat heb je bijgeleerd</w:t>
-      </w:r>
-    </w:p>
-    <w:p>
-      <w:pPr>
-        <w:shd w:fill="F5F5F5" w:val="clear"/>
-        <w:spacing w:after="160" w:before="80"/>
-        <w:ind w:left="360"/>
-      </w:pPr>
-      <w:r>
-        <w:rPr>
-          <w:i/>
-          <w:iCs/>
-          <w:color w:val="888888"/>
-        </w:rPr>
-        <w:t xml:space="preserve">→ vul in na afronding van het project</w:t>
+        <w:t xml:space="preserve">Voor dit project werd de Freesound API key rechtstreeks als constante in index.js geplaatst. In een schoolcontext is dit aanvaardbaar, maar in een professionele of productieomgeving is dit een serieus veiligheidsrisico. De correcte aanpak is het gebruik van een .env bestand in combinatie met een tool zoals dotenv, waarbij de key nooit in de repository terechtkomt via een .gitignore regel. Dit was buiten de scope van de opdracht maar het is een bewuste keuze geweest, niet een gebrek aan kennis.</w:t>
       </w:r>
     </w:p>
     <w:p>

</xml_diff>